<commit_message>
Se añadió el ejemplo del drop down menu box/spinner
</commit_message>
<xml_diff>
--- a/Andoid/Jetpack Compose/Jetpack Compose.docx
+++ b/Andoid/Jetpack Compose/Jetpack Compose.docx
@@ -184,6 +184,11 @@
           <w14:ligatures w14:val="none"/>
         </w:rPr>
       </w:r>
+      <w:r>
+        <w:rPr>
+          <w14:ligatures w14:val="none"/>
+        </w:rPr>
+      </w:r>
     </w:p>
     <w:p>
       <w:pPr>
@@ -221,7 +226,10 @@
       </w:r>
       <w:r>
         <w:rPr>
-          <w:sz w:val="24"/>
+          <w:rFonts w:ascii="Arial" w:hAnsi="Arial" w:eastAsia="Arial" w:cs="Arial"/>
+          <w:color w:val="7a7e85"/>
+          <w:sz w:val="24"/>
+          <w:szCs w:val="24"/>
         </w:rPr>
       </w:r>
       <w:r>
@@ -443,6 +451,12 @@
           <w:szCs w:val="24"/>
         </w:rPr>
       </w:r>
+      <w:r>
+        <w:rPr>
+          <w:sz w:val="24"/>
+          <w:szCs w:val="24"/>
+        </w:rPr>
+      </w:r>
     </w:p>
     <w:p>
       <w:pPr>
@@ -488,7 +502,10 @@
       </w:r>
       <w:r>
         <w:rPr>
-          <w:sz w:val="24"/>
+          <w:rFonts w:ascii="Arial" w:hAnsi="Arial" w:eastAsia="Arial" w:cs="Arial"/>
+          <w:color w:val="7a7e85"/>
+          <w:sz w:val="24"/>
+          <w:szCs w:val="24"/>
         </w:rPr>
       </w:r>
       <w:r>
@@ -561,8 +578,11 @@
       </w:r>
       <w:r>
         <w:rPr>
+          <w:rFonts w:ascii="Arial" w:hAnsi="Arial" w:eastAsia="Arial" w:cs="Arial"/>
+          <w:color w:val="bcbec4"/>
           <w:sz w:val="24"/>
           <w:szCs w:val="24"/>
+          <w:highlight w:val="none"/>
         </w:rPr>
       </w:r>
       <w:r>
@@ -630,10 +650,9 @@
       </w:r>
       <w:r>
         <w:rPr>
-          <w:rFonts w:ascii="Arial" w:hAnsi="Arial" w:eastAsia="Arial" w:cs="Arial"/>
           <w:color w:val="7f7f7f" w:themeColor="text1" w:themeTint="80"/>
           <w:sz w:val="24"/>
-          <w:highlight w:val="none"/>
+          <w:szCs w:val="24"/>
         </w:rPr>
       </w:r>
       <w:r>
@@ -723,7 +742,12 @@
       </w:r>
       <w:r>
         <w:rPr>
-          <w:sz w:val="24"/>
+          <w:rFonts w:ascii="Arial" w:hAnsi="Arial" w:eastAsia="Arial" w:cs="Arial"/>
+          <w:b/>
+          <w:bCs/>
+          <w:color w:val="bcbec4"/>
+          <w:sz w:val="24"/>
+          <w:szCs w:val="24"/>
         </w:rPr>
       </w:r>
       <w:r>
@@ -819,6 +843,10 @@
       </w:r>
       <w:r>
         <w:rPr>
+          <w:rFonts w:ascii="Arial" w:hAnsi="Arial" w:eastAsia="Arial" w:cs="Arial"/>
+          <w:b/>
+          <w:bCs/>
+          <w:color w:val="bcbec4"/>
           <w:sz w:val="24"/>
           <w:szCs w:val="24"/>
         </w:rPr>
@@ -916,6 +944,10 @@
       </w:r>
       <w:r>
         <w:rPr>
+          <w:rFonts w:ascii="Arial" w:hAnsi="Arial" w:eastAsia="Arial" w:cs="Arial"/>
+          <w:b/>
+          <w:bCs/>
+          <w:color w:val="bcbec4"/>
           <w:sz w:val="24"/>
           <w:szCs w:val="24"/>
         </w:rPr>
@@ -1013,6 +1045,10 @@
       </w:r>
       <w:r>
         <w:rPr>
+          <w:rFonts w:ascii="Arial" w:hAnsi="Arial" w:eastAsia="Arial" w:cs="Arial"/>
+          <w:b/>
+          <w:bCs/>
+          <w:color w:val="bcbec4"/>
           <w:sz w:val="24"/>
           <w:szCs w:val="24"/>
         </w:rPr>
@@ -1110,6 +1146,10 @@
       </w:r>
       <w:r>
         <w:rPr>
+          <w:rFonts w:ascii="Arial" w:hAnsi="Arial" w:eastAsia="Arial" w:cs="Arial"/>
+          <w:b/>
+          <w:bCs/>
+          <w:color w:val="bcbec4"/>
           <w:sz w:val="24"/>
           <w:szCs w:val="24"/>
         </w:rPr>
@@ -1207,6 +1247,10 @@
       </w:r>
       <w:r>
         <w:rPr>
+          <w:rFonts w:ascii="Arial" w:hAnsi="Arial" w:eastAsia="Arial" w:cs="Arial"/>
+          <w:b/>
+          <w:bCs/>
+          <w:color w:val="bcbec4"/>
           <w:sz w:val="24"/>
           <w:szCs w:val="24"/>
         </w:rPr>
@@ -1296,6 +1340,10 @@
       </w:r>
       <w:r>
         <w:rPr>
+          <w:rFonts w:ascii="Arial" w:hAnsi="Arial" w:eastAsia="Arial" w:cs="Arial"/>
+          <w:b/>
+          <w:bCs/>
+          <w:color w:val="bcbec4"/>
           <w:sz w:val="24"/>
           <w:szCs w:val="24"/>
         </w:rPr>
@@ -1393,6 +1441,10 @@
       </w:r>
       <w:r>
         <w:rPr>
+          <w:rFonts w:ascii="Arial" w:hAnsi="Arial" w:eastAsia="Arial" w:cs="Arial"/>
+          <w:b/>
+          <w:bCs/>
+          <w:color w:val="bcbec4"/>
           <w:sz w:val="24"/>
           <w:szCs w:val="24"/>
         </w:rPr>
@@ -1439,6 +1491,12 @@
           <w:szCs w:val="24"/>
         </w:rPr>
       </w:r>
+      <w:r>
+        <w:rPr>
+          <w:sz w:val="24"/>
+          <w:szCs w:val="24"/>
+        </w:rPr>
+      </w:r>
     </w:p>
     <w:p>
       <w:pPr>
@@ -1507,6 +1565,17 @@
           <w:highlight w:val="none"/>
         </w:rPr>
       </w:r>
+      <w:r>
+        <w:rPr>
+          <w:rStyle w:val="838"/>
+          <w:b/>
+          <w:bCs/>
+          <w:color w:val="000000" w:themeColor="text1"/>
+          <w:sz w:val="36"/>
+          <w:szCs w:val="36"/>
+          <w:highlight w:val="none"/>
+        </w:rPr>
+      </w:r>
     </w:p>
     <w:p>
       <w:pPr>
@@ -1528,19 +1597,15 @@
       </w:r>
       <w:r>
         <w:rPr>
-          <w:b/>
-          <w:bCs/>
           <w:i w:val="0"/>
           <w:iCs w:val="0"/>
-          <w:color w:val="000000" w:themeColor="text1"/>
-          <w:sz w:val="36"/>
-          <w:szCs w:val="36"/>
-        </w:rPr>
-      </w:r>
-      <w:r>
-        <w:rPr>
+        </w:rPr>
+      </w:r>
+      <w:r>
+        <w:rPr>
+          <w:bCs w:val="0"/>
           <w:i w:val="0"/>
-          <w:iCs w:val="0"/>
+          <w14:ligatures w14:val="none"/>
         </w:rPr>
       </w:r>
     </w:p>
@@ -1602,7 +1667,7 @@
           <w:rFonts w:ascii="Arial" w:hAnsi="Arial" w:eastAsia="Arial" w:cs="Arial"/>
           <w:color w:val="7f7f7f" w:themeColor="text1" w:themeTint="80"/>
           <w:sz w:val="24"/>
-          <w:highlight w:val="none"/>
+          <w:szCs w:val="24"/>
         </w:rPr>
       </w:r>
     </w:p>
@@ -1775,6 +1840,14 @@
           <w:highlight w:val="none"/>
         </w:rPr>
       </w:r>
+      <w:r>
+        <w:rPr>
+          <w:rFonts w:ascii="Arial" w:hAnsi="Arial" w:eastAsia="Arial" w:cs="Arial"/>
+          <w:color w:val="bcbec4"/>
+          <w:sz w:val="24"/>
+          <w:szCs w:val="24"/>
+        </w:rPr>
+      </w:r>
     </w:p>
     <w:p>
       <w:pPr>
@@ -1972,6 +2045,14 @@
         <w:rPr>
           <w:rFonts w:ascii="Arial" w:hAnsi="Arial" w:eastAsia="Arial" w:cs="Arial"/>
           <w:color w:val="cf8e6d"/>
+          <w:sz w:val="24"/>
+          <w:szCs w:val="24"/>
+        </w:rPr>
+      </w:r>
+      <w:r>
+        <w:rPr>
+          <w:rFonts w:ascii="Arial" w:hAnsi="Arial" w:eastAsia="Arial" w:cs="Arial"/>
+          <w:color w:val="bcbec4"/>
           <w:sz w:val="24"/>
           <w:szCs w:val="24"/>
         </w:rPr>
@@ -2019,6 +2100,14 @@
           <w:szCs w:val="24"/>
         </w:rPr>
       </w:r>
+      <w:r>
+        <w:rPr>
+          <w:rFonts w:ascii="Arial" w:hAnsi="Arial" w:eastAsia="Arial" w:cs="Arial"/>
+          <w:color w:val="7f7f7f" w:themeColor="text1" w:themeTint="80"/>
+          <w:sz w:val="24"/>
+          <w:szCs w:val="24"/>
+        </w:rPr>
+      </w:r>
     </w:p>
     <w:p>
       <w:pPr>
@@ -2061,7 +2150,14 @@
           <w:szCs w:val="24"/>
         </w:rPr>
       </w:r>
-      <w:r/>
+      <w:r>
+        <w:rPr>
+          <w:rFonts w:ascii="Arial" w:hAnsi="Arial" w:eastAsia="Arial" w:cs="Arial"/>
+          <w:color w:val="b3ae60"/>
+          <w:sz w:val="24"/>
+          <w:szCs w:val="24"/>
+        </w:rPr>
+      </w:r>
     </w:p>
     <w:p>
       <w:pPr>
@@ -2097,8 +2193,14 @@
         </w:rPr>
         <w:t xml:space="preserve"> </w:t>
       </w:r>
-      <w:r/>
-      <w:r/>
+      <w:r>
+        <w:rPr>
+          <w:rFonts w:ascii="Arial" w:hAnsi="Arial" w:eastAsia="Arial" w:cs="Arial"/>
+          <w:color w:val="cf8e6d"/>
+          <w:sz w:val="24"/>
+          <w:szCs w:val="24"/>
+        </w:rPr>
+      </w:r>
     </w:p>
     <w:p>
       <w:pPr>
@@ -2152,6 +2254,14 @@
           <w:szCs w:val="24"/>
         </w:rPr>
       </w:r>
+      <w:r>
+        <w:rPr>
+          <w:rFonts w:ascii="Arial" w:hAnsi="Arial" w:eastAsia="Arial" w:cs="Arial"/>
+          <w:color w:val="bcbec4"/>
+          <w:sz w:val="24"/>
+          <w:szCs w:val="24"/>
+        </w:rPr>
+      </w:r>
     </w:p>
     <w:p>
       <w:pPr>
@@ -2201,27 +2311,28 @@
       <w:r>
         <w:rPr>
           <w:rFonts w:ascii="Arial" w:hAnsi="Arial" w:eastAsia="Arial" w:cs="Arial"/>
+          <w:color w:val="6bb38a"/>
+          <w:sz w:val="24"/>
+        </w:rPr>
+        <w:t xml:space="preserve">Fondo</w:t>
+      </w:r>
+      <w:r>
+        <w:rPr>
+          <w:rFonts w:ascii="Arial" w:hAnsi="Arial" w:eastAsia="Arial" w:cs="Arial"/>
+          <w:color w:val="bcbec4"/>
+          <w:sz w:val="24"/>
+        </w:rPr>
+        <w:t xml:space="preserve">()</w:t>
+        <w:tab/>
+      </w:r>
+      <w:r>
+        <w:rPr>
+          <w:rFonts w:ascii="Arial" w:hAnsi="Arial" w:eastAsia="Arial" w:cs="Arial"/>
           <w:b/>
           <w:color w:val="bcbec4"/>
           <w:sz w:val="24"/>
         </w:rPr>
-      </w:r>
-      <w:r>
-        <w:rPr>
-          <w:rFonts w:ascii="Arial" w:hAnsi="Arial" w:eastAsia="Arial" w:cs="Arial"/>
-          <w:color w:val="6bb38a"/>
-          <w:sz w:val="24"/>
-        </w:rPr>
-        <w:t xml:space="preserve">Fondo</w:t>
-      </w:r>
-      <w:r>
-        <w:rPr>
-          <w:rFonts w:ascii="Arial" w:hAnsi="Arial" w:eastAsia="Arial" w:cs="Arial"/>
-          <w:color w:val="bcbec4"/>
-          <w:sz w:val="24"/>
-        </w:rPr>
-        <w:t xml:space="preserve">()</w:t>
-        <w:tab/>
+        <w:t xml:space="preserve">}</w:t>
       </w:r>
       <w:r>
         <w:rPr>
@@ -2233,34 +2344,6 @@
           <w:szCs w:val="24"/>
         </w:rPr>
       </w:r>
-      <w:r>
-        <w:rPr>
-          <w:rFonts w:ascii="Arial" w:hAnsi="Arial" w:eastAsia="Arial" w:cs="Arial"/>
-          <w:b/>
-          <w:bCs/>
-          <w:color w:val="bcbec4"/>
-          <w:sz w:val="24"/>
-          <w:szCs w:val="24"/>
-        </w:rPr>
-      </w:r>
-      <w:r>
-        <w:rPr>
-          <w:rFonts w:ascii="Arial" w:hAnsi="Arial" w:eastAsia="Arial" w:cs="Arial"/>
-          <w:color w:val="bcbec4"/>
-          <w:sz w:val="24"/>
-        </w:rPr>
-      </w:r>
-      <w:r>
-        <w:rPr>
-          <w:rFonts w:ascii="Arial" w:hAnsi="Arial" w:eastAsia="Arial" w:cs="Arial"/>
-          <w:b/>
-          <w:color w:val="bcbec4"/>
-          <w:sz w:val="24"/>
-        </w:rPr>
-        <w:t xml:space="preserve">}</w:t>
-      </w:r>
-      <w:r/>
-      <w:r/>
       <w:r>
         <w:rPr>
           <w:rFonts w:ascii="Arial" w:hAnsi="Arial" w:eastAsia="Arial" w:cs="Arial"/>
@@ -2304,8 +2387,12 @@
         </w:rPr>
         <w:t xml:space="preserve">}</w:t>
       </w:r>
-      <w:r/>
-      <w:r/>
+      <w:r>
+        <w:rPr>
+          <w:sz w:val="24"/>
+          <w:szCs w:val="24"/>
+        </w:rPr>
+      </w:r>
     </w:p>
     <w:p>
       <w:pPr>
@@ -2318,9 +2405,30 @@
       </w:pPr>
       <w:r>
         <w:rPr>
-          <w:highlight w:val="none"/>
-        </w:rPr>
-      </w:r>
+          <w14:ligatures w14:val="none"/>
+        </w:rPr>
+      </w:r>
+      <w:r>
+        <w:rPr>
+          <w14:ligatures w14:val="none"/>
+        </w:rPr>
+      </w:r>
+      <w:r>
+        <w:rPr>
+          <w14:ligatures w14:val="none"/>
+        </w:rPr>
+      </w:r>
+    </w:p>
+    <w:p>
+      <w:pPr>
+        <w:pStyle w:val="828"/>
+        <w:pBdr/>
+        <w:spacing/>
+        <w:ind/>
+        <w:rPr>
+          <w14:ligatures w14:val="none"/>
+        </w:rPr>
+      </w:pPr>
       <w:r>
         <w:rPr>
           <w:rStyle w:val="838"/>
@@ -2331,8 +2439,1522 @@
           <w:szCs w:val="36"/>
           <w:highlight w:val="none"/>
         </w:rPr>
+        <w:t xml:space="preserve">Exposed Drope down menu box</w:t>
+      </w:r>
+      <w:r>
+        <w:rPr>
+          <w14:ligatures w14:val="none"/>
+        </w:rPr>
+      </w:r>
+    </w:p>
+    <w:p>
+      <w:pPr>
+        <w:pBdr/>
+        <w:spacing/>
+        <w:ind/>
+        <w:rPr>
+          <w:highlight w:val="none"/>
+          <w14:ligatures w14:val="none"/>
+        </w:rPr>
+      </w:pPr>
+      <w:r>
+        <w:t xml:space="preserve">El siguiente es un ejemplo del equivalente a un spinner pero en jetpack compose, este muestra unidades de conversi</w:t>
+      </w:r>
+      <w:r>
+        <w:t xml:space="preserve">ón.</w:t>
       </w:r>
       <w:r/>
+    </w:p>
+    <w:p>
+      <w:pPr>
+        <w:pBdr>
+          <w:top w:val="none" w:color="000000" w:sz="4" w:space="0"/>
+          <w:left w:val="none" w:color="000000" w:sz="4" w:space="0"/>
+          <w:bottom w:val="none" w:color="000000" w:sz="4" w:space="0"/>
+          <w:right w:val="none" w:color="000000" w:sz="4" w:space="0"/>
+        </w:pBdr>
+        <w:shd w:val="clear" w:color="1e1f22" w:fill="1e1f22"/>
+        <w:spacing/>
+        <w:ind w:right="0" w:firstLine="0" w:left="0"/>
+        <w:rPr/>
+      </w:pPr>
+      <w:r>
+        <w:rPr>
+          <w:rFonts w:ascii="Arial" w:hAnsi="Arial" w:eastAsia="Arial" w:cs="Arial"/>
+          <w:color w:val="b3ae60"/>
+          <w:sz w:val="24"/>
+        </w:rPr>
+        <w:t xml:space="preserve">@OptIn</w:t>
+      </w:r>
+      <w:r>
+        <w:rPr>
+          <w:rFonts w:ascii="Arial" w:hAnsi="Arial" w:eastAsia="Arial" w:cs="Arial"/>
+          <w:color w:val="bcbec4"/>
+          <w:sz w:val="24"/>
+        </w:rPr>
+        <w:t xml:space="preserve">(</w:t>
+      </w:r>
+      <w:r>
+        <w:rPr>
+          <w:rFonts w:ascii="Arial" w:hAnsi="Arial" w:eastAsia="Arial" w:cs="Arial"/>
+          <w:color w:val="b3ae60"/>
+          <w:sz w:val="24"/>
+        </w:rPr>
+        <w:t xml:space="preserve">ExperimentalMaterial3Api</w:t>
+      </w:r>
+      <w:r>
+        <w:rPr>
+          <w:rFonts w:ascii="Arial" w:hAnsi="Arial" w:eastAsia="Arial" w:cs="Arial"/>
+          <w:color w:val="bcbec4"/>
+          <w:sz w:val="24"/>
+        </w:rPr>
+        <w:t xml:space="preserve">::</w:t>
+      </w:r>
+      <w:r>
+        <w:rPr>
+          <w:rFonts w:ascii="Arial" w:hAnsi="Arial" w:eastAsia="Arial" w:cs="Arial"/>
+          <w:color w:val="cf8e6d"/>
+          <w:sz w:val="24"/>
+        </w:rPr>
+        <w:t xml:space="preserve">class</w:t>
+      </w:r>
+      <w:r>
+        <w:rPr>
+          <w:rFonts w:ascii="Arial" w:hAnsi="Arial" w:eastAsia="Arial" w:cs="Arial"/>
+          <w:color w:val="bcbec4"/>
+          <w:sz w:val="24"/>
+        </w:rPr>
+        <w:t xml:space="preserve">)</w:t>
+        <w:br/>
+      </w:r>
+      <w:r>
+        <w:rPr>
+          <w:rFonts w:ascii="Arial" w:hAnsi="Arial" w:eastAsia="Arial" w:cs="Arial"/>
+          <w:color w:val="b3ae60"/>
+          <w:sz w:val="24"/>
+        </w:rPr>
+        <w:t xml:space="preserve">@Composable</w:t>
+      </w:r>
+      <w:r>
+        <w:rPr>
+          <w:rFonts w:ascii="Arial" w:hAnsi="Arial" w:eastAsia="Arial" w:cs="Arial"/>
+          <w:color w:val="cf8e6d"/>
+          <w:sz w:val="24"/>
+        </w:rPr>
+        <w:t xml:space="preserve">fun </w:t>
+      </w:r>
+      <w:r>
+        <w:rPr>
+          <w:rFonts w:ascii="Arial" w:hAnsi="Arial" w:eastAsia="Arial" w:cs="Arial"/>
+          <w:color w:val="56a8f5"/>
+          <w:sz w:val="24"/>
+        </w:rPr>
+        <w:t xml:space="preserve">MenuDesplegable</w:t>
+      </w:r>
+      <w:r>
+        <w:rPr>
+          <w:rFonts w:ascii="Arial" w:hAnsi="Arial" w:eastAsia="Arial" w:cs="Arial"/>
+          <w:color w:val="bcbec4"/>
+          <w:sz w:val="24"/>
+        </w:rPr>
+        <w:t xml:space="preserve">(navController: NavHostController) {</w:t>
+        <w:br/>
+        <w:t xml:space="preserve">    </w:t>
+      </w:r>
+      <w:r>
+        <w:rPr>
+          <w:rFonts w:ascii="Arial" w:hAnsi="Arial" w:eastAsia="Arial" w:cs="Arial"/>
+          <w:color w:val="cf8e6d"/>
+          <w:sz w:val="24"/>
+        </w:rPr>
+        <w:t xml:space="preserve">var </w:t>
+      </w:r>
+      <w:r>
+        <w:rPr>
+          <w:rFonts w:ascii="Arial" w:hAnsi="Arial" w:eastAsia="Arial" w:cs="Arial"/>
+          <w:color w:val="bcbec4"/>
+          <w:sz w:val="24"/>
+        </w:rPr>
+        <w:t xml:space="preserve">expandido </w:t>
+      </w:r>
+      <w:r>
+        <w:rPr>
+          <w:rFonts w:ascii="Arial" w:hAnsi="Arial" w:eastAsia="Arial" w:cs="Arial"/>
+          <w:color w:val="cf8e6d"/>
+          <w:sz w:val="24"/>
+        </w:rPr>
+        <w:t xml:space="preserve">by </w:t>
+      </w:r>
+      <w:r>
+        <w:rPr>
+          <w:rFonts w:ascii="Arial" w:hAnsi="Arial" w:eastAsia="Arial" w:cs="Arial"/>
+          <w:color w:val="6bb38a"/>
+          <w:sz w:val="24"/>
+        </w:rPr>
+        <w:t xml:space="preserve">remember </w:t>
+      </w:r>
+      <w:r>
+        <w:rPr>
+          <w:rFonts w:ascii="Arial" w:hAnsi="Arial" w:eastAsia="Arial" w:cs="Arial"/>
+          <w:b/>
+          <w:color w:val="bcbec4"/>
+          <w:sz w:val="24"/>
+        </w:rPr>
+        <w:t xml:space="preserve">{ </w:t>
+      </w:r>
+      <w:r>
+        <w:rPr>
+          <w:rFonts w:ascii="Arial" w:hAnsi="Arial" w:eastAsia="Arial" w:cs="Arial"/>
+          <w:i/>
+          <w:color w:val="bcbec4"/>
+          <w:sz w:val="24"/>
+        </w:rPr>
+        <w:t xml:space="preserve">mutableStateOf</w:t>
+      </w:r>
+      <w:r>
+        <w:rPr>
+          <w:rFonts w:ascii="Arial" w:hAnsi="Arial" w:eastAsia="Arial" w:cs="Arial"/>
+          <w:color w:val="bcbec4"/>
+          <w:sz w:val="24"/>
+        </w:rPr>
+        <w:t xml:space="preserve">(</w:t>
+      </w:r>
+      <w:r>
+        <w:rPr>
+          <w:rFonts w:ascii="Arial" w:hAnsi="Arial" w:eastAsia="Arial" w:cs="Arial"/>
+          <w:color w:val="cf8e6d"/>
+          <w:sz w:val="24"/>
+        </w:rPr>
+        <w:t xml:space="preserve">false</w:t>
+      </w:r>
+      <w:r>
+        <w:rPr>
+          <w:rFonts w:ascii="Arial" w:hAnsi="Arial" w:eastAsia="Arial" w:cs="Arial"/>
+          <w:color w:val="bcbec4"/>
+          <w:sz w:val="24"/>
+        </w:rPr>
+        <w:t xml:space="preserve">) </w:t>
+      </w:r>
+      <w:r>
+        <w:rPr>
+          <w:rFonts w:ascii="Arial" w:hAnsi="Arial" w:eastAsia="Arial" w:cs="Arial"/>
+          <w:b/>
+          <w:color w:val="bcbec4"/>
+          <w:sz w:val="24"/>
+        </w:rPr>
+        <w:t xml:space="preserve">}    </w:t>
+      </w:r>
+      <w:r>
+        <w:rPr>
+          <w:rFonts w:ascii="Arial" w:hAnsi="Arial" w:eastAsia="Arial" w:cs="Arial"/>
+          <w:color w:val="cf8e6d"/>
+          <w:sz w:val="24"/>
+        </w:rPr>
+        <w:t xml:space="preserve">val </w:t>
+      </w:r>
+      <w:r>
+        <w:rPr>
+          <w:rFonts w:ascii="Arial" w:hAnsi="Arial" w:eastAsia="Arial" w:cs="Arial"/>
+          <w:color w:val="bcbec4"/>
+          <w:sz w:val="24"/>
+        </w:rPr>
+        <w:t xml:space="preserve">opciones = </w:t>
+      </w:r>
+      <w:r>
+        <w:rPr>
+          <w:rFonts w:ascii="Arial" w:hAnsi="Arial" w:eastAsia="Arial" w:cs="Arial"/>
+          <w:i/>
+          <w:color w:val="bcbec4"/>
+          <w:sz w:val="24"/>
+        </w:rPr>
+        <w:t xml:space="preserve">listOf</w:t>
+      </w:r>
+      <w:r>
+        <w:rPr>
+          <w:rFonts w:ascii="Arial" w:hAnsi="Arial" w:eastAsia="Arial" w:cs="Arial"/>
+          <w:color w:val="bcbec4"/>
+          <w:sz w:val="24"/>
+        </w:rPr>
+        <w:t xml:space="preserve">(</w:t>
+        <w:br/>
+        <w:t xml:space="preserve">        </w:t>
+      </w:r>
+      <w:r>
+        <w:rPr>
+          <w:rFonts w:ascii="Arial" w:hAnsi="Arial" w:eastAsia="Arial" w:cs="Arial"/>
+          <w:color w:val="6aab73"/>
+          <w:sz w:val="24"/>
+        </w:rPr>
+        <w:t xml:space="preserve">"Temperatura" </w:t>
+      </w:r>
+      <w:r>
+        <w:rPr>
+          <w:rFonts w:ascii="Arial" w:hAnsi="Arial" w:eastAsia="Arial" w:cs="Arial"/>
+          <w:i/>
+          <w:color w:val="57aaf7"/>
+          <w:sz w:val="24"/>
+        </w:rPr>
+        <w:t xml:space="preserve">to </w:t>
+      </w:r>
+      <w:r>
+        <w:rPr>
+          <w:rFonts w:ascii="Arial" w:hAnsi="Arial" w:eastAsia="Arial" w:cs="Arial"/>
+          <w:color w:val="bcbec4"/>
+          <w:sz w:val="24"/>
+        </w:rPr>
+        <w:t xml:space="preserve">Temperatura,</w:t>
+        <w:br/>
+        <w:t xml:space="preserve">        </w:t>
+      </w:r>
+      <w:r>
+        <w:rPr>
+          <w:rFonts w:ascii="Arial" w:hAnsi="Arial" w:eastAsia="Arial" w:cs="Arial"/>
+          <w:color w:val="6aab73"/>
+          <w:sz w:val="24"/>
+        </w:rPr>
+        <w:t xml:space="preserve">"Área" </w:t>
+      </w:r>
+      <w:r>
+        <w:rPr>
+          <w:rFonts w:ascii="Arial" w:hAnsi="Arial" w:eastAsia="Arial" w:cs="Arial"/>
+          <w:i/>
+          <w:color w:val="57aaf7"/>
+          <w:sz w:val="24"/>
+        </w:rPr>
+        <w:t xml:space="preserve">to </w:t>
+      </w:r>
+      <w:r>
+        <w:rPr>
+          <w:rFonts w:ascii="Arial" w:hAnsi="Arial" w:eastAsia="Arial" w:cs="Arial"/>
+          <w:color w:val="bcbec4"/>
+          <w:sz w:val="24"/>
+        </w:rPr>
+        <w:t xml:space="preserve">Area,</w:t>
+        <w:br/>
+        <w:t xml:space="preserve">        </w:t>
+      </w:r>
+      <w:r>
+        <w:rPr>
+          <w:rFonts w:ascii="Arial" w:hAnsi="Arial" w:eastAsia="Arial" w:cs="Arial"/>
+          <w:color w:val="6aab73"/>
+          <w:sz w:val="24"/>
+        </w:rPr>
+        <w:t xml:space="preserve">"Volumen" </w:t>
+      </w:r>
+      <w:r>
+        <w:rPr>
+          <w:rFonts w:ascii="Arial" w:hAnsi="Arial" w:eastAsia="Arial" w:cs="Arial"/>
+          <w:i/>
+          <w:color w:val="57aaf7"/>
+          <w:sz w:val="24"/>
+        </w:rPr>
+        <w:t xml:space="preserve">to </w:t>
+      </w:r>
+      <w:r>
+        <w:rPr>
+          <w:rFonts w:ascii="Arial" w:hAnsi="Arial" w:eastAsia="Arial" w:cs="Arial"/>
+          <w:color w:val="bcbec4"/>
+          <w:sz w:val="24"/>
+        </w:rPr>
+        <w:t xml:space="preserve">Volumen,</w:t>
+        <w:br/>
+        <w:t xml:space="preserve">        </w:t>
+      </w:r>
+      <w:r>
+        <w:rPr>
+          <w:rFonts w:ascii="Arial" w:hAnsi="Arial" w:eastAsia="Arial" w:cs="Arial"/>
+          <w:color w:val="6aab73"/>
+          <w:sz w:val="24"/>
+        </w:rPr>
+        <w:t xml:space="preserve">"Tiempo" </w:t>
+      </w:r>
+      <w:r>
+        <w:rPr>
+          <w:rFonts w:ascii="Arial" w:hAnsi="Arial" w:eastAsia="Arial" w:cs="Arial"/>
+          <w:i/>
+          <w:color w:val="57aaf7"/>
+          <w:sz w:val="24"/>
+        </w:rPr>
+        <w:t xml:space="preserve">to </w:t>
+      </w:r>
+      <w:r>
+        <w:rPr>
+          <w:rFonts w:ascii="Arial" w:hAnsi="Arial" w:eastAsia="Arial" w:cs="Arial"/>
+          <w:color w:val="bcbec4"/>
+          <w:sz w:val="24"/>
+        </w:rPr>
+        <w:t xml:space="preserve">Tiempo,</w:t>
+        <w:br/>
+        <w:t xml:space="preserve">        </w:t>
+      </w:r>
+      <w:r>
+        <w:rPr>
+          <w:rFonts w:ascii="Arial" w:hAnsi="Arial" w:eastAsia="Arial" w:cs="Arial"/>
+          <w:color w:val="6aab73"/>
+          <w:sz w:val="24"/>
+        </w:rPr>
+        <w:t xml:space="preserve">"Velocidad" </w:t>
+      </w:r>
+      <w:r>
+        <w:rPr>
+          <w:rFonts w:ascii="Arial" w:hAnsi="Arial" w:eastAsia="Arial" w:cs="Arial"/>
+          <w:i/>
+          <w:color w:val="57aaf7"/>
+          <w:sz w:val="24"/>
+        </w:rPr>
+        <w:t xml:space="preserve">to </w:t>
+      </w:r>
+      <w:r>
+        <w:rPr>
+          <w:rFonts w:ascii="Arial" w:hAnsi="Arial" w:eastAsia="Arial" w:cs="Arial"/>
+          <w:color w:val="bcbec4"/>
+          <w:sz w:val="24"/>
+        </w:rPr>
+        <w:t xml:space="preserve">Velocidad,</w:t>
+        <w:br/>
+        <w:t xml:space="preserve">        </w:t>
+      </w:r>
+      <w:r>
+        <w:rPr>
+          <w:rFonts w:ascii="Arial" w:hAnsi="Arial" w:eastAsia="Arial" w:cs="Arial"/>
+          <w:color w:val="6aab73"/>
+          <w:sz w:val="24"/>
+        </w:rPr>
+        <w:t xml:space="preserve">"Masa" </w:t>
+      </w:r>
+      <w:r>
+        <w:rPr>
+          <w:rFonts w:ascii="Arial" w:hAnsi="Arial" w:eastAsia="Arial" w:cs="Arial"/>
+          <w:i/>
+          <w:color w:val="57aaf7"/>
+          <w:sz w:val="24"/>
+        </w:rPr>
+        <w:t xml:space="preserve">to </w:t>
+      </w:r>
+      <w:r>
+        <w:rPr>
+          <w:rFonts w:ascii="Arial" w:hAnsi="Arial" w:eastAsia="Arial" w:cs="Arial"/>
+          <w:color w:val="bcbec4"/>
+          <w:sz w:val="24"/>
+        </w:rPr>
+        <w:t xml:space="preserve">Peso,</w:t>
+        <w:br/>
+        <w:t xml:space="preserve">        </w:t>
+      </w:r>
+      <w:r>
+        <w:rPr>
+          <w:rFonts w:ascii="Arial" w:hAnsi="Arial" w:eastAsia="Arial" w:cs="Arial"/>
+          <w:color w:val="6aab73"/>
+          <w:sz w:val="24"/>
+        </w:rPr>
+        <w:t xml:space="preserve">"Longitud" </w:t>
+      </w:r>
+      <w:r>
+        <w:rPr>
+          <w:rFonts w:ascii="Arial" w:hAnsi="Arial" w:eastAsia="Arial" w:cs="Arial"/>
+          <w:i/>
+          <w:color w:val="57aaf7"/>
+          <w:sz w:val="24"/>
+        </w:rPr>
+        <w:t xml:space="preserve">to </w:t>
+      </w:r>
+      <w:r>
+        <w:rPr>
+          <w:rFonts w:ascii="Arial" w:hAnsi="Arial" w:eastAsia="Arial" w:cs="Arial"/>
+          <w:color w:val="bcbec4"/>
+          <w:sz w:val="24"/>
+        </w:rPr>
+        <w:t xml:space="preserve">Longitud</w:t>
+        <w:br/>
+        <w:t xml:space="preserve">    )</w:t>
+        <w:br/>
+        <w:t xml:space="preserve">    </w:t>
+      </w:r>
+      <w:r>
+        <w:rPr>
+          <w:rFonts w:ascii="Arial" w:hAnsi="Arial" w:eastAsia="Arial" w:cs="Arial"/>
+          <w:color w:val="cf8e6d"/>
+          <w:sz w:val="24"/>
+        </w:rPr>
+        <w:t xml:space="preserve">var </w:t>
+      </w:r>
+      <w:r>
+        <w:rPr>
+          <w:rFonts w:ascii="Arial" w:hAnsi="Arial" w:eastAsia="Arial" w:cs="Arial"/>
+          <w:color w:val="bcbec4"/>
+          <w:sz w:val="24"/>
+        </w:rPr>
+        <w:t xml:space="preserve">unidadSeleccionada </w:t>
+      </w:r>
+      <w:r>
+        <w:rPr>
+          <w:rFonts w:ascii="Arial" w:hAnsi="Arial" w:eastAsia="Arial" w:cs="Arial"/>
+          <w:color w:val="cf8e6d"/>
+          <w:sz w:val="24"/>
+        </w:rPr>
+        <w:t xml:space="preserve">by </w:t>
+      </w:r>
+      <w:r>
+        <w:rPr>
+          <w:rFonts w:ascii="Arial" w:hAnsi="Arial" w:eastAsia="Arial" w:cs="Arial"/>
+          <w:color w:val="6bb38a"/>
+          <w:sz w:val="24"/>
+        </w:rPr>
+        <w:t xml:space="preserve">remember </w:t>
+      </w:r>
+      <w:r>
+        <w:rPr>
+          <w:rFonts w:ascii="Arial" w:hAnsi="Arial" w:eastAsia="Arial" w:cs="Arial"/>
+          <w:b/>
+          <w:color w:val="bcbec4"/>
+          <w:sz w:val="24"/>
+        </w:rPr>
+        <w:t xml:space="preserve">{ </w:t>
+      </w:r>
+      <w:r>
+        <w:rPr>
+          <w:rFonts w:ascii="Arial" w:hAnsi="Arial" w:eastAsia="Arial" w:cs="Arial"/>
+          <w:i/>
+          <w:color w:val="bcbec4"/>
+          <w:sz w:val="24"/>
+        </w:rPr>
+        <w:t xml:space="preserve">mutableStateOf</w:t>
+      </w:r>
+      <w:r>
+        <w:rPr>
+          <w:rFonts w:ascii="Arial" w:hAnsi="Arial" w:eastAsia="Arial" w:cs="Arial"/>
+          <w:color w:val="bcbec4"/>
+          <w:sz w:val="24"/>
+        </w:rPr>
+        <w:t xml:space="preserve">(opciones[</w:t>
+      </w:r>
+      <w:r>
+        <w:rPr>
+          <w:rFonts w:ascii="Arial" w:hAnsi="Arial" w:eastAsia="Arial" w:cs="Arial"/>
+          <w:color w:val="2aacb8"/>
+          <w:sz w:val="24"/>
+        </w:rPr>
+        <w:t xml:space="preserve">0</w:t>
+      </w:r>
+      <w:r>
+        <w:rPr>
+          <w:rFonts w:ascii="Arial" w:hAnsi="Arial" w:eastAsia="Arial" w:cs="Arial"/>
+          <w:color w:val="bcbec4"/>
+          <w:sz w:val="24"/>
+        </w:rPr>
+        <w:t xml:space="preserve">]) </w:t>
+      </w:r>
+      <w:r>
+        <w:rPr>
+          <w:rFonts w:ascii="Arial" w:hAnsi="Arial" w:eastAsia="Arial" w:cs="Arial"/>
+          <w:b/>
+          <w:color w:val="bcbec4"/>
+          <w:sz w:val="24"/>
+        </w:rPr>
+        <w:t xml:space="preserve">}    </w:t>
+      </w:r>
+      <w:r>
+        <w:rPr>
+          <w:rFonts w:ascii="Arial" w:hAnsi="Arial" w:eastAsia="Arial" w:cs="Arial"/>
+          <w:color w:val="0da19e"/>
+          <w:sz w:val="24"/>
+        </w:rPr>
+        <w:t xml:space="preserve">Box </w:t>
+      </w:r>
+      <w:r>
+        <w:rPr>
+          <w:rFonts w:ascii="Arial" w:hAnsi="Arial" w:eastAsia="Arial" w:cs="Arial"/>
+          <w:b/>
+          <w:color w:val="bcbec4"/>
+          <w:sz w:val="24"/>
+        </w:rPr>
+        <w:t xml:space="preserve">{        </w:t>
+      </w:r>
+      <w:r>
+        <w:rPr>
+          <w:rFonts w:ascii="Arial" w:hAnsi="Arial" w:eastAsia="Arial" w:cs="Arial"/>
+          <w:color w:val="6bb38a"/>
+          <w:sz w:val="24"/>
+        </w:rPr>
+        <w:t xml:space="preserve">ExposedDropdownMenuBox</w:t>
+      </w:r>
+      <w:r>
+        <w:rPr>
+          <w:rFonts w:ascii="Arial" w:hAnsi="Arial" w:eastAsia="Arial" w:cs="Arial"/>
+          <w:color w:val="bcbec4"/>
+          <w:sz w:val="24"/>
+        </w:rPr>
+        <w:t xml:space="preserve">(</w:t>
+        <w:br/>
+        <w:t xml:space="preserve">            </w:t>
+      </w:r>
+      <w:r>
+        <w:rPr>
+          <w:rFonts w:ascii="Arial" w:hAnsi="Arial" w:eastAsia="Arial" w:cs="Arial"/>
+          <w:color w:val="56c1d6"/>
+          <w:sz w:val="24"/>
+        </w:rPr>
+        <w:t xml:space="preserve">expanded = </w:t>
+      </w:r>
+      <w:r>
+        <w:rPr>
+          <w:rFonts w:ascii="Arial" w:hAnsi="Arial" w:eastAsia="Arial" w:cs="Arial"/>
+          <w:color w:val="bcbec4"/>
+          <w:sz w:val="24"/>
+        </w:rPr>
+        <w:t xml:space="preserve">expandido,</w:t>
+        <w:br/>
+        <w:t xml:space="preserve">            </w:t>
+      </w:r>
+      <w:r>
+        <w:rPr>
+          <w:rFonts w:ascii="Arial" w:hAnsi="Arial" w:eastAsia="Arial" w:cs="Arial"/>
+          <w:color w:val="56c1d6"/>
+          <w:sz w:val="24"/>
+        </w:rPr>
+        <w:t xml:space="preserve">onExpandedChange = </w:t>
+      </w:r>
+      <w:r>
+        <w:rPr>
+          <w:rFonts w:ascii="Arial" w:hAnsi="Arial" w:eastAsia="Arial" w:cs="Arial"/>
+          <w:b/>
+          <w:color w:val="bcbec4"/>
+          <w:sz w:val="24"/>
+        </w:rPr>
+        <w:t xml:space="preserve">{ </w:t>
+      </w:r>
+      <w:r>
+        <w:rPr>
+          <w:rFonts w:ascii="Arial" w:hAnsi="Arial" w:eastAsia="Arial" w:cs="Arial"/>
+          <w:color w:val="bcbec4"/>
+          <w:sz w:val="24"/>
+        </w:rPr>
+        <w:t xml:space="preserve">expandido = </w:t>
+      </w:r>
+      <w:r>
+        <w:rPr>
+          <w:rFonts w:ascii="Arial" w:hAnsi="Arial" w:eastAsia="Arial" w:cs="Arial"/>
+          <w:b/>
+          <w:color w:val="bcbec4"/>
+          <w:sz w:val="24"/>
+        </w:rPr>
+        <w:t xml:space="preserve">it }        </w:t>
+      </w:r>
+      <w:r>
+        <w:rPr>
+          <w:rFonts w:ascii="Arial" w:hAnsi="Arial" w:eastAsia="Arial" w:cs="Arial"/>
+          <w:color w:val="bcbec4"/>
+          <w:sz w:val="24"/>
+        </w:rPr>
+        <w:t xml:space="preserve">) </w:t>
+      </w:r>
+      <w:r>
+        <w:rPr>
+          <w:rFonts w:ascii="Arial" w:hAnsi="Arial" w:eastAsia="Arial" w:cs="Arial"/>
+          <w:b/>
+          <w:color w:val="bcbec4"/>
+          <w:sz w:val="24"/>
+        </w:rPr>
+        <w:t xml:space="preserve">{            </w:t>
+      </w:r>
+      <w:r>
+        <w:rPr>
+          <w:rFonts w:ascii="Arial" w:hAnsi="Arial" w:eastAsia="Arial" w:cs="Arial"/>
+          <w:color w:val="6bb38a"/>
+          <w:sz w:val="24"/>
+        </w:rPr>
+        <w:t xml:space="preserve">OutlinedTextField</w:t>
+      </w:r>
+      <w:r>
+        <w:rPr>
+          <w:rFonts w:ascii="Arial" w:hAnsi="Arial" w:eastAsia="Arial" w:cs="Arial"/>
+          <w:color w:val="bcbec4"/>
+          <w:sz w:val="24"/>
+        </w:rPr>
+        <w:t xml:space="preserve">(</w:t>
+        <w:br/>
+        <w:t xml:space="preserve">                </w:t>
+      </w:r>
+      <w:r>
+        <w:rPr>
+          <w:rFonts w:ascii="Arial" w:hAnsi="Arial" w:eastAsia="Arial" w:cs="Arial"/>
+          <w:color w:val="56c1d6"/>
+          <w:sz w:val="24"/>
+        </w:rPr>
+        <w:t xml:space="preserve">value = </w:t>
+      </w:r>
+      <w:r>
+        <w:rPr>
+          <w:rFonts w:ascii="Arial" w:hAnsi="Arial" w:eastAsia="Arial" w:cs="Arial"/>
+          <w:color w:val="bcbec4"/>
+          <w:sz w:val="24"/>
+        </w:rPr>
+        <w:t xml:space="preserve">unidadSeleccionada.</w:t>
+      </w:r>
+      <w:r>
+        <w:rPr>
+          <w:rFonts w:ascii="Arial" w:hAnsi="Arial" w:eastAsia="Arial" w:cs="Arial"/>
+          <w:color w:val="c77dbb"/>
+          <w:sz w:val="24"/>
+        </w:rPr>
+        <w:t xml:space="preserve">first</w:t>
+      </w:r>
+      <w:r>
+        <w:rPr>
+          <w:rFonts w:ascii="Arial" w:hAnsi="Arial" w:eastAsia="Arial" w:cs="Arial"/>
+          <w:color w:val="bcbec4"/>
+          <w:sz w:val="24"/>
+        </w:rPr>
+        <w:t xml:space="preserve">,</w:t>
+        <w:br/>
+        <w:t xml:space="preserve">                </w:t>
+      </w:r>
+      <w:r>
+        <w:rPr>
+          <w:rFonts w:ascii="Arial" w:hAnsi="Arial" w:eastAsia="Arial" w:cs="Arial"/>
+          <w:color w:val="56c1d6"/>
+          <w:sz w:val="24"/>
+        </w:rPr>
+        <w:t xml:space="preserve">onValueChange = </w:t>
+      </w:r>
+      <w:r>
+        <w:rPr>
+          <w:rFonts w:ascii="Arial" w:hAnsi="Arial" w:eastAsia="Arial" w:cs="Arial"/>
+          <w:b/>
+          <w:color w:val="bcbec4"/>
+          <w:sz w:val="24"/>
+        </w:rPr>
+        <w:t xml:space="preserve">{}</w:t>
+      </w:r>
+      <w:r>
+        <w:rPr>
+          <w:rFonts w:ascii="Arial" w:hAnsi="Arial" w:eastAsia="Arial" w:cs="Arial"/>
+          <w:color w:val="bcbec4"/>
+          <w:sz w:val="24"/>
+        </w:rPr>
+        <w:t xml:space="preserve">,</w:t>
+        <w:br/>
+        <w:t xml:space="preserve">                </w:t>
+      </w:r>
+      <w:r>
+        <w:rPr>
+          <w:rFonts w:ascii="Arial" w:hAnsi="Arial" w:eastAsia="Arial" w:cs="Arial"/>
+          <w:color w:val="56c1d6"/>
+          <w:sz w:val="24"/>
+        </w:rPr>
+        <w:t xml:space="preserve">readOnly = </w:t>
+      </w:r>
+      <w:r>
+        <w:rPr>
+          <w:rFonts w:ascii="Arial" w:hAnsi="Arial" w:eastAsia="Arial" w:cs="Arial"/>
+          <w:color w:val="cf8e6d"/>
+          <w:sz w:val="24"/>
+        </w:rPr>
+        <w:t xml:space="preserve">true</w:t>
+      </w:r>
+      <w:r>
+        <w:rPr>
+          <w:rFonts w:ascii="Arial" w:hAnsi="Arial" w:eastAsia="Arial" w:cs="Arial"/>
+          <w:color w:val="bcbec4"/>
+          <w:sz w:val="24"/>
+        </w:rPr>
+        <w:t xml:space="preserve">,</w:t>
+        <w:br/>
+        <w:t xml:space="preserve">                </w:t>
+      </w:r>
+      <w:r>
+        <w:rPr>
+          <w:rFonts w:ascii="Arial" w:hAnsi="Arial" w:eastAsia="Arial" w:cs="Arial"/>
+          <w:color w:val="56c1d6"/>
+          <w:sz w:val="24"/>
+        </w:rPr>
+        <w:t xml:space="preserve">label = </w:t>
+      </w:r>
+      <w:r>
+        <w:rPr>
+          <w:rFonts w:ascii="Arial" w:hAnsi="Arial" w:eastAsia="Arial" w:cs="Arial"/>
+          <w:b/>
+          <w:color w:val="bcbec4"/>
+          <w:sz w:val="24"/>
+        </w:rPr>
+        <w:t xml:space="preserve">{ </w:t>
+      </w:r>
+      <w:r>
+        <w:rPr>
+          <w:rFonts w:ascii="Arial" w:hAnsi="Arial" w:eastAsia="Arial" w:cs="Arial"/>
+          <w:color w:val="6bb38a"/>
+          <w:sz w:val="24"/>
+        </w:rPr>
+        <w:t xml:space="preserve">Text</w:t>
+      </w:r>
+      <w:r>
+        <w:rPr>
+          <w:rFonts w:ascii="Arial" w:hAnsi="Arial" w:eastAsia="Arial" w:cs="Arial"/>
+          <w:color w:val="bcbec4"/>
+          <w:sz w:val="24"/>
+        </w:rPr>
+        <w:t xml:space="preserve">(</w:t>
+      </w:r>
+      <w:r>
+        <w:rPr>
+          <w:rFonts w:ascii="Arial" w:hAnsi="Arial" w:eastAsia="Arial" w:cs="Arial"/>
+          <w:color w:val="56c1d6"/>
+          <w:sz w:val="24"/>
+        </w:rPr>
+        <w:t xml:space="preserve">text = </w:t>
+      </w:r>
+      <w:r>
+        <w:rPr>
+          <w:rFonts w:ascii="Arial" w:hAnsi="Arial" w:eastAsia="Arial" w:cs="Arial"/>
+          <w:color w:val="6aab73"/>
+          <w:sz w:val="24"/>
+        </w:rPr>
+        <w:t xml:space="preserve">"Unidad"</w:t>
+      </w:r>
+      <w:r>
+        <w:rPr>
+          <w:rFonts w:ascii="Arial" w:hAnsi="Arial" w:eastAsia="Arial" w:cs="Arial"/>
+          <w:color w:val="bcbec4"/>
+          <w:sz w:val="24"/>
+        </w:rPr>
+        <w:t xml:space="preserve">) </w:t>
+      </w:r>
+      <w:r>
+        <w:rPr>
+          <w:rFonts w:ascii="Arial" w:hAnsi="Arial" w:eastAsia="Arial" w:cs="Arial"/>
+          <w:b/>
+          <w:color w:val="bcbec4"/>
+          <w:sz w:val="24"/>
+        </w:rPr>
+        <w:t xml:space="preserve">}</w:t>
+      </w:r>
+      <w:r>
+        <w:rPr>
+          <w:rFonts w:ascii="Arial" w:hAnsi="Arial" w:eastAsia="Arial" w:cs="Arial"/>
+          <w:color w:val="bcbec4"/>
+          <w:sz w:val="24"/>
+        </w:rPr>
+        <w:t xml:space="preserve">,</w:t>
+        <w:br/>
+        <w:t xml:space="preserve">                </w:t>
+      </w:r>
+      <w:r>
+        <w:rPr>
+          <w:rFonts w:ascii="Arial" w:hAnsi="Arial" w:eastAsia="Arial" w:cs="Arial"/>
+          <w:color w:val="56c1d6"/>
+          <w:sz w:val="24"/>
+        </w:rPr>
+        <w:t xml:space="preserve">trailingIcon = </w:t>
+      </w:r>
+      <w:r>
+        <w:rPr>
+          <w:rFonts w:ascii="Arial" w:hAnsi="Arial" w:eastAsia="Arial" w:cs="Arial"/>
+          <w:b/>
+          <w:color w:val="bcbec4"/>
+          <w:sz w:val="24"/>
+        </w:rPr>
+        <w:t xml:space="preserve">{                    </w:t>
+      </w:r>
+      <w:r>
+        <w:rPr>
+          <w:rFonts w:ascii="Arial" w:hAnsi="Arial" w:eastAsia="Arial" w:cs="Arial"/>
+          <w:color w:val="bcbec4"/>
+          <w:sz w:val="24"/>
+        </w:rPr>
+        <w:t xml:space="preserve">ExposedDropdownMenuDefaults.</w:t>
+      </w:r>
+      <w:r>
+        <w:rPr>
+          <w:rFonts w:ascii="Arial" w:hAnsi="Arial" w:eastAsia="Arial" w:cs="Arial"/>
+          <w:color w:val="6bb38a"/>
+          <w:sz w:val="24"/>
+        </w:rPr>
+        <w:t xml:space="preserve">TrailingIcon</w:t>
+      </w:r>
+      <w:r>
+        <w:rPr>
+          <w:rFonts w:ascii="Arial" w:hAnsi="Arial" w:eastAsia="Arial" w:cs="Arial"/>
+          <w:color w:val="bcbec4"/>
+          <w:sz w:val="24"/>
+        </w:rPr>
+        <w:t xml:space="preserve">(</w:t>
+      </w:r>
+      <w:r>
+        <w:rPr>
+          <w:rFonts w:ascii="Arial" w:hAnsi="Arial" w:eastAsia="Arial" w:cs="Arial"/>
+          <w:color w:val="56c1d6"/>
+          <w:sz w:val="24"/>
+        </w:rPr>
+        <w:t xml:space="preserve">expanded = </w:t>
+      </w:r>
+      <w:r>
+        <w:rPr>
+          <w:rFonts w:ascii="Arial" w:hAnsi="Arial" w:eastAsia="Arial" w:cs="Arial"/>
+          <w:color w:val="bcbec4"/>
+          <w:sz w:val="24"/>
+        </w:rPr>
+        <w:t xml:space="preserve">expandido)</w:t>
+        <w:br/>
+        <w:t xml:space="preserve">                </w:t>
+      </w:r>
+      <w:r>
+        <w:rPr>
+          <w:rFonts w:ascii="Arial" w:hAnsi="Arial" w:eastAsia="Arial" w:cs="Arial"/>
+          <w:b/>
+          <w:color w:val="bcbec4"/>
+          <w:sz w:val="24"/>
+        </w:rPr>
+        <w:t xml:space="preserve">}</w:t>
+      </w:r>
+      <w:r>
+        <w:rPr>
+          <w:rFonts w:ascii="Arial" w:hAnsi="Arial" w:eastAsia="Arial" w:cs="Arial"/>
+          <w:color w:val="bcbec4"/>
+          <w:sz w:val="24"/>
+        </w:rPr>
+        <w:t xml:space="preserve">,</w:t>
+        <w:br/>
+        <w:t xml:space="preserve">                </w:t>
+      </w:r>
+      <w:r>
+        <w:rPr>
+          <w:rFonts w:ascii="Arial" w:hAnsi="Arial" w:eastAsia="Arial" w:cs="Arial"/>
+          <w:color w:val="56c1d6"/>
+          <w:sz w:val="24"/>
+        </w:rPr>
+        <w:t xml:space="preserve">modifier = </w:t>
+      </w:r>
+      <w:r>
+        <w:rPr>
+          <w:rFonts w:ascii="Arial" w:hAnsi="Arial" w:eastAsia="Arial" w:cs="Arial"/>
+          <w:color w:val="bcbec4"/>
+          <w:sz w:val="24"/>
+        </w:rPr>
+        <w:t xml:space="preserve">Modifier</w:t>
+        <w:br/>
+        <w:t xml:space="preserve">                    .</w:t>
+      </w:r>
+      <w:r>
+        <w:rPr>
+          <w:rFonts w:ascii="Arial" w:hAnsi="Arial" w:eastAsia="Arial" w:cs="Arial"/>
+          <w:i/>
+          <w:color w:val="57aaf7"/>
+          <w:sz w:val="24"/>
+        </w:rPr>
+        <w:t xml:space="preserve">menuAnchor</w:t>
+      </w:r>
+      <w:r>
+        <w:rPr>
+          <w:rFonts w:ascii="Arial" w:hAnsi="Arial" w:eastAsia="Arial" w:cs="Arial"/>
+          <w:color w:val="bcbec4"/>
+          <w:sz w:val="24"/>
+        </w:rPr>
+        <w:t xml:space="preserve">()</w:t>
+        <w:br/>
+        <w:t xml:space="preserve">                    .</w:t>
+      </w:r>
+      <w:r>
+        <w:rPr>
+          <w:rFonts w:ascii="Arial" w:hAnsi="Arial" w:eastAsia="Arial" w:cs="Arial"/>
+          <w:i/>
+          <w:color w:val="57aaf7"/>
+          <w:sz w:val="24"/>
+        </w:rPr>
+        <w:t xml:space="preserve">width</w:t>
+      </w:r>
+      <w:r>
+        <w:rPr>
+          <w:rFonts w:ascii="Arial" w:hAnsi="Arial" w:eastAsia="Arial" w:cs="Arial"/>
+          <w:color w:val="bcbec4"/>
+          <w:sz w:val="24"/>
+        </w:rPr>
+        <w:t xml:space="preserve">(IntrinsicSize.</w:t>
+      </w:r>
+      <w:r>
+        <w:rPr>
+          <w:rFonts w:ascii="Arial" w:hAnsi="Arial" w:eastAsia="Arial" w:cs="Arial"/>
+          <w:i/>
+          <w:color w:val="c77dbb"/>
+          <w:sz w:val="24"/>
+        </w:rPr>
+        <w:t xml:space="preserve">Min</w:t>
+      </w:r>
+      <w:r>
+        <w:rPr>
+          <w:rFonts w:ascii="Arial" w:hAnsi="Arial" w:eastAsia="Arial" w:cs="Arial"/>
+          <w:color w:val="bcbec4"/>
+          <w:sz w:val="24"/>
+        </w:rPr>
+        <w:t xml:space="preserve">) </w:t>
+      </w:r>
+      <w:r>
+        <w:rPr>
+          <w:rFonts w:ascii="Arial" w:hAnsi="Arial" w:eastAsia="Arial" w:cs="Arial"/>
+          <w:color w:val="7a7e85"/>
+          <w:sz w:val="24"/>
+        </w:rPr>
+        <w:t xml:space="preserve">// Se ajusta al contenido mínimo necesario            </w:t>
+      </w:r>
+      <w:r>
+        <w:rPr>
+          <w:rFonts w:ascii="Arial" w:hAnsi="Arial" w:eastAsia="Arial" w:cs="Arial"/>
+          <w:color w:val="bcbec4"/>
+          <w:sz w:val="24"/>
+        </w:rPr>
+        <w:t xml:space="preserve">)</w:t>
+        <w:br/>
+        <w:t xml:space="preserve">            </w:t>
+      </w:r>
+      <w:r>
+        <w:rPr>
+          <w:rFonts w:ascii="Arial" w:hAnsi="Arial" w:eastAsia="Arial" w:cs="Arial"/>
+          <w:color w:val="7a7e85"/>
+          <w:sz w:val="24"/>
+        </w:rPr>
+        <w:t xml:space="preserve">// El menú que se despliega            </w:t>
+      </w:r>
+      <w:r>
+        <w:rPr>
+          <w:rFonts w:ascii="Arial" w:hAnsi="Arial" w:eastAsia="Arial" w:cs="Arial"/>
+          <w:color w:val="0da19e"/>
+          <w:sz w:val="24"/>
+        </w:rPr>
+        <w:t xml:space="preserve">ExposedDropdownMenu</w:t>
+      </w:r>
+      <w:r>
+        <w:rPr>
+          <w:rFonts w:ascii="Arial" w:hAnsi="Arial" w:eastAsia="Arial" w:cs="Arial"/>
+          <w:color w:val="bcbec4"/>
+          <w:sz w:val="24"/>
+        </w:rPr>
+        <w:t xml:space="preserve">(</w:t>
+        <w:br/>
+        <w:t xml:space="preserve">                </w:t>
+      </w:r>
+      <w:r>
+        <w:rPr>
+          <w:rFonts w:ascii="Arial" w:hAnsi="Arial" w:eastAsia="Arial" w:cs="Arial"/>
+          <w:color w:val="56c1d6"/>
+          <w:sz w:val="24"/>
+        </w:rPr>
+        <w:t xml:space="preserve">expanded = </w:t>
+      </w:r>
+      <w:r>
+        <w:rPr>
+          <w:rFonts w:ascii="Arial" w:hAnsi="Arial" w:eastAsia="Arial" w:cs="Arial"/>
+          <w:color w:val="bcbec4"/>
+          <w:sz w:val="24"/>
+        </w:rPr>
+        <w:t xml:space="preserve">expandido,</w:t>
+        <w:br/>
+        <w:t xml:space="preserve">                </w:t>
+      </w:r>
+      <w:r>
+        <w:rPr>
+          <w:rFonts w:ascii="Arial" w:hAnsi="Arial" w:eastAsia="Arial" w:cs="Arial"/>
+          <w:color w:val="56c1d6"/>
+          <w:sz w:val="24"/>
+        </w:rPr>
+        <w:t xml:space="preserve">onDismissRequest = </w:t>
+      </w:r>
+      <w:r>
+        <w:rPr>
+          <w:rFonts w:ascii="Arial" w:hAnsi="Arial" w:eastAsia="Arial" w:cs="Arial"/>
+          <w:b/>
+          <w:color w:val="bcbec4"/>
+          <w:sz w:val="24"/>
+        </w:rPr>
+        <w:t xml:space="preserve">{ </w:t>
+      </w:r>
+      <w:r>
+        <w:rPr>
+          <w:rFonts w:ascii="Arial" w:hAnsi="Arial" w:eastAsia="Arial" w:cs="Arial"/>
+          <w:color w:val="bcbec4"/>
+          <w:sz w:val="24"/>
+        </w:rPr>
+        <w:t xml:space="preserve">expandido = </w:t>
+      </w:r>
+      <w:r>
+        <w:rPr>
+          <w:rFonts w:ascii="Arial" w:hAnsi="Arial" w:eastAsia="Arial" w:cs="Arial"/>
+          <w:color w:val="cf8e6d"/>
+          <w:sz w:val="24"/>
+        </w:rPr>
+        <w:t xml:space="preserve">false </w:t>
+      </w:r>
+      <w:r>
+        <w:rPr>
+          <w:rFonts w:ascii="Arial" w:hAnsi="Arial" w:eastAsia="Arial" w:cs="Arial"/>
+          <w:b/>
+          <w:color w:val="bcbec4"/>
+          <w:sz w:val="24"/>
+        </w:rPr>
+        <w:t xml:space="preserve">}            </w:t>
+      </w:r>
+      <w:r>
+        <w:rPr>
+          <w:rFonts w:ascii="Arial" w:hAnsi="Arial" w:eastAsia="Arial" w:cs="Arial"/>
+          <w:color w:val="bcbec4"/>
+          <w:sz w:val="24"/>
+        </w:rPr>
+        <w:t xml:space="preserve">) </w:t>
+      </w:r>
+      <w:r>
+        <w:rPr>
+          <w:rFonts w:ascii="Arial" w:hAnsi="Arial" w:eastAsia="Arial" w:cs="Arial"/>
+          <w:b/>
+          <w:color w:val="bcbec4"/>
+          <w:sz w:val="24"/>
+        </w:rPr>
+        <w:t xml:space="preserve">{                </w:t>
+      </w:r>
+      <w:r>
+        <w:rPr>
+          <w:rFonts w:ascii="Arial" w:hAnsi="Arial" w:eastAsia="Arial" w:cs="Arial"/>
+          <w:color w:val="bcbec4"/>
+          <w:sz w:val="24"/>
+        </w:rPr>
+        <w:t xml:space="preserve">opciones.</w:t>
+      </w:r>
+      <w:r>
+        <w:rPr>
+          <w:rFonts w:ascii="Arial" w:hAnsi="Arial" w:eastAsia="Arial" w:cs="Arial"/>
+          <w:i/>
+          <w:color w:val="57aaf7"/>
+          <w:sz w:val="24"/>
+        </w:rPr>
+        <w:t xml:space="preserve">forEach </w:t>
+      </w:r>
+      <w:r>
+        <w:rPr>
+          <w:rFonts w:ascii="Arial" w:hAnsi="Arial" w:eastAsia="Arial" w:cs="Arial"/>
+          <w:b/>
+          <w:color w:val="bcbec4"/>
+          <w:sz w:val="24"/>
+        </w:rPr>
+        <w:t xml:space="preserve">{ </w:t>
+      </w:r>
+      <w:r>
+        <w:rPr>
+          <w:rFonts w:ascii="Arial" w:hAnsi="Arial" w:eastAsia="Arial" w:cs="Arial"/>
+          <w:color w:val="bcbec4"/>
+          <w:sz w:val="24"/>
+        </w:rPr>
+        <w:t xml:space="preserve">unidad </w:t>
+      </w:r>
+      <w:r>
+        <w:rPr>
+          <w:rFonts w:ascii="Arial" w:hAnsi="Arial" w:eastAsia="Arial" w:cs="Arial"/>
+          <w:b/>
+          <w:color w:val="bcbec4"/>
+          <w:sz w:val="24"/>
+        </w:rPr>
+        <w:t xml:space="preserve">-&gt;                    </w:t>
+      </w:r>
+      <w:r>
+        <w:rPr>
+          <w:rFonts w:ascii="Arial" w:hAnsi="Arial" w:eastAsia="Arial" w:cs="Arial"/>
+          <w:color w:val="6bb38a"/>
+          <w:sz w:val="24"/>
+        </w:rPr>
+        <w:t xml:space="preserve">DropdownMenuItem</w:t>
+      </w:r>
+      <w:r>
+        <w:rPr>
+          <w:rFonts w:ascii="Arial" w:hAnsi="Arial" w:eastAsia="Arial" w:cs="Arial"/>
+          <w:color w:val="bcbec4"/>
+          <w:sz w:val="24"/>
+        </w:rPr>
+        <w:t xml:space="preserve">(</w:t>
+        <w:br/>
+        <w:t xml:space="preserve">                        </w:t>
+      </w:r>
+      <w:r>
+        <w:rPr>
+          <w:rFonts w:ascii="Arial" w:hAnsi="Arial" w:eastAsia="Arial" w:cs="Arial"/>
+          <w:color w:val="56c1d6"/>
+          <w:sz w:val="24"/>
+        </w:rPr>
+        <w:t xml:space="preserve">text = </w:t>
+      </w:r>
+      <w:r>
+        <w:rPr>
+          <w:rFonts w:ascii="Arial" w:hAnsi="Arial" w:eastAsia="Arial" w:cs="Arial"/>
+          <w:b/>
+          <w:color w:val="bcbec4"/>
+          <w:sz w:val="24"/>
+        </w:rPr>
+        <w:t xml:space="preserve">{ </w:t>
+      </w:r>
+      <w:r>
+        <w:rPr>
+          <w:rFonts w:ascii="Arial" w:hAnsi="Arial" w:eastAsia="Arial" w:cs="Arial"/>
+          <w:color w:val="6bb38a"/>
+          <w:sz w:val="24"/>
+        </w:rPr>
+        <w:t xml:space="preserve">Text</w:t>
+      </w:r>
+      <w:r>
+        <w:rPr>
+          <w:rFonts w:ascii="Arial" w:hAnsi="Arial" w:eastAsia="Arial" w:cs="Arial"/>
+          <w:color w:val="bcbec4"/>
+          <w:sz w:val="24"/>
+        </w:rPr>
+        <w:t xml:space="preserve">(unidad.</w:t>
+      </w:r>
+      <w:r>
+        <w:rPr>
+          <w:rFonts w:ascii="Arial" w:hAnsi="Arial" w:eastAsia="Arial" w:cs="Arial"/>
+          <w:color w:val="c77dbb"/>
+          <w:sz w:val="24"/>
+        </w:rPr>
+        <w:t xml:space="preserve">first</w:t>
+      </w:r>
+      <w:r>
+        <w:rPr>
+          <w:rFonts w:ascii="Arial" w:hAnsi="Arial" w:eastAsia="Arial" w:cs="Arial"/>
+          <w:color w:val="bcbec4"/>
+          <w:sz w:val="24"/>
+        </w:rPr>
+        <w:t xml:space="preserve">) </w:t>
+      </w:r>
+      <w:r>
+        <w:rPr>
+          <w:rFonts w:ascii="Arial" w:hAnsi="Arial" w:eastAsia="Arial" w:cs="Arial"/>
+          <w:b/>
+          <w:color w:val="bcbec4"/>
+          <w:sz w:val="24"/>
+        </w:rPr>
+        <w:t xml:space="preserve">}</w:t>
+      </w:r>
+      <w:r>
+        <w:rPr>
+          <w:rFonts w:ascii="Arial" w:hAnsi="Arial" w:eastAsia="Arial" w:cs="Arial"/>
+          <w:color w:val="bcbec4"/>
+          <w:sz w:val="24"/>
+        </w:rPr>
+        <w:t xml:space="preserve">,</w:t>
+        <w:br/>
+        <w:t xml:space="preserve">                        </w:t>
+      </w:r>
+      <w:r>
+        <w:rPr>
+          <w:rFonts w:ascii="Arial" w:hAnsi="Arial" w:eastAsia="Arial" w:cs="Arial"/>
+          <w:color w:val="56c1d6"/>
+          <w:sz w:val="24"/>
+        </w:rPr>
+        <w:t xml:space="preserve">onClick = </w:t>
+      </w:r>
+      <w:r>
+        <w:rPr>
+          <w:rFonts w:ascii="Arial" w:hAnsi="Arial" w:eastAsia="Arial" w:cs="Arial"/>
+          <w:b/>
+          <w:color w:val="bcbec4"/>
+          <w:sz w:val="24"/>
+        </w:rPr>
+        <w:t xml:space="preserve">{                            </w:t>
+      </w:r>
+      <w:r>
+        <w:rPr>
+          <w:rFonts w:ascii="Arial" w:hAnsi="Arial" w:eastAsia="Arial" w:cs="Arial"/>
+          <w:color w:val="bcbec4"/>
+          <w:sz w:val="24"/>
+        </w:rPr>
+        <w:t xml:space="preserve">unidadSeleccionada = unidad</w:t>
+        <w:br/>
+        <w:t xml:space="preserve">                            expandido = </w:t>
+      </w:r>
+      <w:r>
+        <w:rPr>
+          <w:rFonts w:ascii="Arial" w:hAnsi="Arial" w:eastAsia="Arial" w:cs="Arial"/>
+          <w:color w:val="cf8e6d"/>
+          <w:sz w:val="24"/>
+        </w:rPr>
+        <w:t xml:space="preserve">false                            </w:t>
+      </w:r>
+      <w:r>
+        <w:rPr>
+          <w:rFonts w:ascii="Arial" w:hAnsi="Arial" w:eastAsia="Arial" w:cs="Arial"/>
+          <w:color w:val="bcbec4"/>
+          <w:sz w:val="24"/>
+        </w:rPr>
+        <w:t xml:space="preserve">navController.</w:t>
+      </w:r>
+      <w:r>
+        <w:rPr>
+          <w:rFonts w:ascii="Arial" w:hAnsi="Arial" w:eastAsia="Arial" w:cs="Arial"/>
+          <w:color w:val="c77dbb"/>
+          <w:sz w:val="24"/>
+        </w:rPr>
+        <w:t xml:space="preserve">navigate</w:t>
+      </w:r>
+      <w:r>
+        <w:rPr>
+          <w:rFonts w:ascii="Arial" w:hAnsi="Arial" w:eastAsia="Arial" w:cs="Arial"/>
+          <w:color w:val="bcbec4"/>
+          <w:sz w:val="24"/>
+        </w:rPr>
+        <w:t xml:space="preserve">(unidad.</w:t>
+      </w:r>
+      <w:r>
+        <w:rPr>
+          <w:rFonts w:ascii="Arial" w:hAnsi="Arial" w:eastAsia="Arial" w:cs="Arial"/>
+          <w:color w:val="c77dbb"/>
+          <w:sz w:val="24"/>
+        </w:rPr>
+        <w:t xml:space="preserve">second</w:t>
+      </w:r>
+      <w:r>
+        <w:rPr>
+          <w:rFonts w:ascii="Arial" w:hAnsi="Arial" w:eastAsia="Arial" w:cs="Arial"/>
+          <w:color w:val="bcbec4"/>
+          <w:sz w:val="24"/>
+        </w:rPr>
+        <w:t xml:space="preserve">) </w:t>
+      </w:r>
+      <w:r>
+        <w:rPr>
+          <w:rFonts w:ascii="Arial" w:hAnsi="Arial" w:eastAsia="Arial" w:cs="Arial"/>
+          <w:b/>
+          <w:color w:val="bcbec4"/>
+          <w:sz w:val="24"/>
+        </w:rPr>
+        <w:t xml:space="preserve">{                                </w:t>
+      </w:r>
+      <w:r>
+        <w:rPr>
+          <w:rFonts w:ascii="Arial" w:hAnsi="Arial" w:eastAsia="Arial" w:cs="Arial"/>
+          <w:color w:val="c77dbb"/>
+          <w:sz w:val="24"/>
+        </w:rPr>
+        <w:t xml:space="preserve">popUpTo</w:t>
+      </w:r>
+      <w:r>
+        <w:rPr>
+          <w:rFonts w:ascii="Arial" w:hAnsi="Arial" w:eastAsia="Arial" w:cs="Arial"/>
+          <w:color w:val="bcbec4"/>
+          <w:sz w:val="24"/>
+        </w:rPr>
+        <w:t xml:space="preserve">(navController.</w:t>
+      </w:r>
+      <w:r>
+        <w:rPr>
+          <w:rFonts w:ascii="Arial" w:hAnsi="Arial" w:eastAsia="Arial" w:cs="Arial"/>
+          <w:color w:val="c77dbb"/>
+          <w:sz w:val="24"/>
+        </w:rPr>
+        <w:t xml:space="preserve">graph</w:t>
+      </w:r>
+      <w:r>
+        <w:rPr>
+          <w:rFonts w:ascii="Arial" w:hAnsi="Arial" w:eastAsia="Arial" w:cs="Arial"/>
+          <w:color w:val="bcbec4"/>
+          <w:sz w:val="24"/>
+        </w:rPr>
+        <w:t xml:space="preserve">.</w:t>
+      </w:r>
+      <w:r>
+        <w:rPr>
+          <w:rFonts w:ascii="Arial" w:hAnsi="Arial" w:eastAsia="Arial" w:cs="Arial"/>
+          <w:color w:val="c77dbb"/>
+          <w:sz w:val="24"/>
+        </w:rPr>
+        <w:t xml:space="preserve">startDestinationId</w:t>
+      </w:r>
+      <w:r>
+        <w:rPr>
+          <w:rFonts w:ascii="Arial" w:hAnsi="Arial" w:eastAsia="Arial" w:cs="Arial"/>
+          <w:color w:val="bcbec4"/>
+          <w:sz w:val="24"/>
+        </w:rPr>
+        <w:t xml:space="preserve">) </w:t>
+      </w:r>
+      <w:r>
+        <w:rPr>
+          <w:rFonts w:ascii="Arial" w:hAnsi="Arial" w:eastAsia="Arial" w:cs="Arial"/>
+          <w:b/>
+          <w:color w:val="bcbec4"/>
+          <w:sz w:val="24"/>
+        </w:rPr>
+        <w:t xml:space="preserve">{                                    </w:t>
+      </w:r>
+      <w:r>
+        <w:rPr>
+          <w:rFonts w:ascii="Arial" w:hAnsi="Arial" w:eastAsia="Arial" w:cs="Arial"/>
+          <w:color w:val="c77dbb"/>
+          <w:sz w:val="24"/>
+        </w:rPr>
+        <w:t xml:space="preserve">saveState </w:t>
+      </w:r>
+      <w:r>
+        <w:rPr>
+          <w:rFonts w:ascii="Arial" w:hAnsi="Arial" w:eastAsia="Arial" w:cs="Arial"/>
+          <w:color w:val="bcbec4"/>
+          <w:sz w:val="24"/>
+        </w:rPr>
+        <w:t xml:space="preserve">= </w:t>
+      </w:r>
+      <w:r>
+        <w:rPr>
+          <w:rFonts w:ascii="Arial" w:hAnsi="Arial" w:eastAsia="Arial" w:cs="Arial"/>
+          <w:color w:val="cf8e6d"/>
+          <w:sz w:val="24"/>
+        </w:rPr>
+        <w:t xml:space="preserve">true                                </w:t>
+      </w:r>
+      <w:r>
+        <w:rPr>
+          <w:rFonts w:ascii="Arial" w:hAnsi="Arial" w:eastAsia="Arial" w:cs="Arial"/>
+          <w:b/>
+          <w:color w:val="bcbec4"/>
+          <w:sz w:val="24"/>
+        </w:rPr>
+        <w:t xml:space="preserve">}                                </w:t>
+      </w:r>
+      <w:r>
+        <w:rPr>
+          <w:rFonts w:ascii="Arial" w:hAnsi="Arial" w:eastAsia="Arial" w:cs="Arial"/>
+          <w:color w:val="c77dbb"/>
+          <w:sz w:val="24"/>
+        </w:rPr>
+        <w:t xml:space="preserve">launchSingleTop </w:t>
+      </w:r>
+      <w:r>
+        <w:rPr>
+          <w:rFonts w:ascii="Arial" w:hAnsi="Arial" w:eastAsia="Arial" w:cs="Arial"/>
+          <w:color w:val="bcbec4"/>
+          <w:sz w:val="24"/>
+        </w:rPr>
+        <w:t xml:space="preserve">= </w:t>
+      </w:r>
+      <w:r>
+        <w:rPr>
+          <w:rFonts w:ascii="Arial" w:hAnsi="Arial" w:eastAsia="Arial" w:cs="Arial"/>
+          <w:color w:val="cf8e6d"/>
+          <w:sz w:val="24"/>
+        </w:rPr>
+        <w:t xml:space="preserve">true                                </w:t>
+      </w:r>
+      <w:r>
+        <w:rPr>
+          <w:rFonts w:ascii="Arial" w:hAnsi="Arial" w:eastAsia="Arial" w:cs="Arial"/>
+          <w:color w:val="c77dbb"/>
+          <w:sz w:val="24"/>
+        </w:rPr>
+        <w:t xml:space="preserve">restoreState </w:t>
+      </w:r>
+      <w:r>
+        <w:rPr>
+          <w:rFonts w:ascii="Arial" w:hAnsi="Arial" w:eastAsia="Arial" w:cs="Arial"/>
+          <w:color w:val="bcbec4"/>
+          <w:sz w:val="24"/>
+        </w:rPr>
+        <w:t xml:space="preserve">= </w:t>
+      </w:r>
+      <w:r>
+        <w:rPr>
+          <w:rFonts w:ascii="Arial" w:hAnsi="Arial" w:eastAsia="Arial" w:cs="Arial"/>
+          <w:color w:val="cf8e6d"/>
+          <w:sz w:val="24"/>
+        </w:rPr>
+        <w:t xml:space="preserve">true                            </w:t>
+      </w:r>
+      <w:r>
+        <w:rPr>
+          <w:rFonts w:ascii="Arial" w:hAnsi="Arial" w:eastAsia="Arial" w:cs="Arial"/>
+          <w:b/>
+          <w:color w:val="bcbec4"/>
+          <w:sz w:val="24"/>
+        </w:rPr>
+        <w:t xml:space="preserve">}                        }</w:t>
+      </w:r>
+      <w:r>
+        <w:rPr>
+          <w:rFonts w:ascii="Arial" w:hAnsi="Arial" w:eastAsia="Arial" w:cs="Arial"/>
+          <w:color w:val="bcbec4"/>
+          <w:sz w:val="24"/>
+        </w:rPr>
+        <w:t xml:space="preserve">,</w:t>
+        <w:br/>
+        <w:t xml:space="preserve">                        </w:t>
+      </w:r>
+      <w:r>
+        <w:rPr>
+          <w:rFonts w:ascii="Arial" w:hAnsi="Arial" w:eastAsia="Arial" w:cs="Arial"/>
+          <w:color w:val="56c1d6"/>
+          <w:sz w:val="24"/>
+        </w:rPr>
+        <w:t xml:space="preserve">contentPadding = </w:t>
+      </w:r>
+      <w:r>
+        <w:rPr>
+          <w:rFonts w:ascii="Arial" w:hAnsi="Arial" w:eastAsia="Arial" w:cs="Arial"/>
+          <w:color w:val="bcbec4"/>
+          <w:sz w:val="24"/>
+        </w:rPr>
+        <w:t xml:space="preserve">ExposedDropdownMenuDefaults.</w:t>
+      </w:r>
+      <w:r>
+        <w:rPr>
+          <w:rFonts w:ascii="Arial" w:hAnsi="Arial" w:eastAsia="Arial" w:cs="Arial"/>
+          <w:color w:val="c77dbb"/>
+          <w:sz w:val="24"/>
+        </w:rPr>
+        <w:t xml:space="preserve">ItemContentPadding                    </w:t>
+      </w:r>
+      <w:r>
+        <w:rPr>
+          <w:rFonts w:ascii="Arial" w:hAnsi="Arial" w:eastAsia="Arial" w:cs="Arial"/>
+          <w:color w:val="bcbec4"/>
+          <w:sz w:val="24"/>
+        </w:rPr>
+        <w:t xml:space="preserve">)</w:t>
+        <w:br/>
+        <w:t xml:space="preserve">                </w:t>
+      </w:r>
+      <w:r>
+        <w:rPr>
+          <w:rFonts w:ascii="Arial" w:hAnsi="Arial" w:eastAsia="Arial" w:cs="Arial"/>
+          <w:b/>
+          <w:color w:val="bcbec4"/>
+          <w:sz w:val="24"/>
+        </w:rPr>
+        <w:t xml:space="preserve">}            }        }    }</w:t>
+      </w:r>
+      <w:r>
+        <w:rPr>
+          <w:rFonts w:ascii="Arial" w:hAnsi="Arial" w:eastAsia="Arial" w:cs="Arial"/>
+          <w:color w:val="bcbec4"/>
+          <w:sz w:val="24"/>
+        </w:rPr>
+        <w:t xml:space="preserve">}</w:t>
+      </w:r>
+      <w:r/>
+    </w:p>
+    <w:p>
+      <w:pPr>
+        <w:pBdr/>
+        <w:spacing/>
+        <w:ind/>
+        <w:rPr>
+          <w14:ligatures w14:val="none"/>
+        </w:rPr>
+      </w:pPr>
+      <w:r>
+        <w:rPr>
+          <w:highlight w:val="none"/>
+        </w:rPr>
+      </w:r>
+      <w:r>
+        <w:rPr>
+          <w:highlight w:val="none"/>
+        </w:rPr>
+      </w:r>
+      <w:r>
+        <w:rPr>
+          <w:highlight w:val="none"/>
+        </w:rPr>
+      </w:r>
     </w:p>
     <w:sectPr>
       <w:footnotePr/>

</xml_diff>

<commit_message>
agregué el scroll vertica para los elementos internos de una columna
</commit_message>
<xml_diff>
--- a/Andoid/Jetpack Compose/Jetpack Compose.docx
+++ b/Andoid/Jetpack Compose/Jetpack Compose.docx
@@ -1597,8 +1597,9 @@
       </w:r>
       <w:r>
         <w:rPr>
+          <w:bCs w:val="0"/>
           <w:i w:val="0"/>
-          <w:iCs w:val="0"/>
+          <w14:ligatures w14:val="none"/>
         </w:rPr>
       </w:r>
       <w:r>
@@ -1659,7 +1660,7 @@
           <w:rFonts w:ascii="Arial" w:hAnsi="Arial" w:eastAsia="Arial" w:cs="Arial"/>
           <w:color w:val="7f7f7f" w:themeColor="text1" w:themeTint="80"/>
           <w:sz w:val="24"/>
-          <w:highlight w:val="none"/>
+          <w:szCs w:val="24"/>
         </w:rPr>
       </w:r>
       <w:r>
@@ -1834,10 +1835,9 @@
       <w:r>
         <w:rPr>
           <w:rFonts w:ascii="Arial" w:hAnsi="Arial" w:eastAsia="Arial" w:cs="Arial"/>
-          <w:color w:val="cf8e6d"/>
+          <w:color w:val="bcbec4"/>
           <w:sz w:val="24"/>
           <w:szCs w:val="24"/>
-          <w:highlight w:val="none"/>
         </w:rPr>
       </w:r>
       <w:r>
@@ -2044,7 +2044,7 @@
       <w:r>
         <w:rPr>
           <w:rFonts w:ascii="Arial" w:hAnsi="Arial" w:eastAsia="Arial" w:cs="Arial"/>
-          <w:color w:val="cf8e6d"/>
+          <w:color w:val="bcbec4"/>
           <w:sz w:val="24"/>
           <w:szCs w:val="24"/>
         </w:rPr>
@@ -2145,7 +2145,7 @@
       <w:r>
         <w:rPr>
           <w:rFonts w:ascii="Arial" w:hAnsi="Arial" w:eastAsia="Arial" w:cs="Arial"/>
-          <w:color w:val="cf8e6d"/>
+          <w:color w:val="b3ae60"/>
           <w:sz w:val="24"/>
           <w:szCs w:val="24"/>
         </w:rPr>
@@ -2201,6 +2201,14 @@
           <w:szCs w:val="24"/>
         </w:rPr>
       </w:r>
+      <w:r>
+        <w:rPr>
+          <w:rFonts w:ascii="Arial" w:hAnsi="Arial" w:eastAsia="Arial" w:cs="Arial"/>
+          <w:color w:val="cf8e6d"/>
+          <w:sz w:val="24"/>
+          <w:szCs w:val="24"/>
+        </w:rPr>
+      </w:r>
     </w:p>
     <w:p>
       <w:pPr>
@@ -2247,8 +2255,6 @@
       <w:r>
         <w:rPr>
           <w:rFonts w:ascii="Arial" w:hAnsi="Arial" w:eastAsia="Arial" w:cs="Arial"/>
-          <w:b/>
-          <w:bCs/>
           <w:color w:val="bcbec4"/>
           <w:sz w:val="24"/>
           <w:szCs w:val="24"/>
@@ -2393,6 +2399,12 @@
           <w:szCs w:val="24"/>
         </w:rPr>
       </w:r>
+      <w:r>
+        <w:rPr>
+          <w:sz w:val="24"/>
+          <w:szCs w:val="24"/>
+        </w:rPr>
+      </w:r>
     </w:p>
     <w:p>
       <w:pPr>
@@ -2439,7 +2451,12 @@
           <w:szCs w:val="36"/>
           <w:highlight w:val="none"/>
         </w:rPr>
-        <w:t xml:space="preserve">Exposed Drope down menu box</w:t>
+        <w:t xml:space="preserve">Exposed drop down menu box</w:t>
+      </w:r>
+      <w:r>
+        <w:rPr>
+          <w14:ligatures w14:val="none"/>
+        </w:rPr>
       </w:r>
       <w:r>
         <w:rPr>
@@ -2463,7 +2480,12 @@
       <w:r>
         <w:t xml:space="preserve">ón.</w:t>
       </w:r>
-      <w:r/>
+      <w:r>
+        <w:rPr>
+          <w:highlight w:val="none"/>
+          <w14:ligatures w14:val="none"/>
+        </w:rPr>
+      </w:r>
     </w:p>
     <w:p>
       <w:pPr>
@@ -3942,6 +3964,541 @@
       </w:pPr>
       <w:r>
         <w:rPr>
+          <w14:ligatures w14:val="none"/>
+        </w:rPr>
+      </w:r>
+      <w:r>
+        <w:rPr>
+          <w14:ligatures w14:val="none"/>
+        </w:rPr>
+      </w:r>
+      <w:r>
+        <w:rPr>
+          <w14:ligatures w14:val="none"/>
+        </w:rPr>
+      </w:r>
+    </w:p>
+    <w:p>
+      <w:pPr>
+        <w:pStyle w:val="828"/>
+        <w:pBdr/>
+        <w:spacing/>
+        <w:ind/>
+        <w:rPr>
+          <w:b/>
+          <w:bCs/>
+          <w:color w:val="000000" w:themeColor="text1"/>
+          <w:sz w:val="36"/>
+          <w:szCs w:val="36"/>
+          <w14:ligatures w14:val="none"/>
+        </w:rPr>
+      </w:pPr>
+      <w:r>
+        <w:rPr>
+          <w:b/>
+          <w:bCs/>
+          <w:color w:val="000000" w:themeColor="text1"/>
+          <w:sz w:val="36"/>
+          <w:szCs w:val="36"/>
+          <w:highlight w:val="none"/>
+        </w:rPr>
+        <w:t xml:space="preserve">Modifier</w:t>
+      </w:r>
+      <w:r>
+        <w:rPr>
+          <w:b/>
+          <w:bCs/>
+          <w:color w:val="000000" w:themeColor="text1"/>
+          <w:sz w:val="36"/>
+          <w:szCs w:val="36"/>
+          <w14:ligatures w14:val="none"/>
+        </w:rPr>
+      </w:r>
+    </w:p>
+    <w:p>
+      <w:pPr>
+        <w:pStyle w:val="829"/>
+        <w:pBdr/>
+        <w:spacing/>
+        <w:ind/>
+        <w:rPr>
+          <w:b/>
+          <w:bCs/>
+          <w:color w:val="000000" w:themeColor="text1"/>
+          <w:sz w:val="32"/>
+          <w:szCs w:val="32"/>
+          <w:highlight w:val="none"/>
+          <w14:ligatures w14:val="none"/>
+        </w:rPr>
+      </w:pPr>
+      <w:r>
+        <w:rPr>
+          <w:b/>
+          <w:bCs/>
+          <w:color w:val="000000" w:themeColor="text1"/>
+          <w:sz w:val="32"/>
+          <w:szCs w:val="32"/>
+          <w14:ligatures w14:val="none"/>
+        </w:rPr>
+        <w:t xml:space="preserve">Row</w:t>
+      </w:r>
+      <w:r>
+        <w:rPr>
+          <w:sz w:val="32"/>
+          <w:szCs w:val="32"/>
+        </w:rPr>
+      </w:r>
+    </w:p>
+    <w:p>
+      <w:pPr>
+        <w:pStyle w:val="829"/>
+        <w:pBdr/>
+        <w:spacing/>
+        <w:ind/>
+        <w:rPr>
+          <w:sz w:val="32"/>
+          <w:szCs w:val="32"/>
+        </w:rPr>
+      </w:pPr>
+      <w:r>
+        <w:rPr>
+          <w:b/>
+          <w:bCs/>
+          <w:color w:val="000000" w:themeColor="text1"/>
+          <w:sz w:val="32"/>
+          <w:szCs w:val="32"/>
+          <w:highlight w:val="none"/>
+          <w14:ligatures w14:val="none"/>
+        </w:rPr>
+        <w:t xml:space="preserve">Column</w:t>
+      </w:r>
+      <w:r>
+        <w:rPr>
+          <w:b/>
+          <w:bCs/>
+          <w:color w:val="000000" w:themeColor="text1"/>
+          <w:sz w:val="32"/>
+          <w:szCs w:val="32"/>
+          <w:highlight w:val="none"/>
+          <w14:ligatures w14:val="none"/>
+        </w:rPr>
+      </w:r>
+      <w:r>
+        <w:rPr>
+          <w:sz w:val="32"/>
+          <w:szCs w:val="32"/>
+        </w:rPr>
+      </w:r>
+    </w:p>
+    <w:p>
+      <w:pPr>
+        <w:pStyle w:val="830"/>
+        <w:pBdr/>
+        <w:spacing/>
+        <w:ind/>
+        <w:rPr>
+          <w:sz w:val="28"/>
+          <w:szCs w:val="28"/>
+        </w:rPr>
+      </w:pPr>
+      <w:r>
+        <w:rPr>
+          <w:b/>
+          <w:bCs/>
+          <w:color w:val="000000" w:themeColor="text1"/>
+          <w:sz w:val="28"/>
+          <w:szCs w:val="28"/>
+          <w:highlight w:val="none"/>
+          <w14:ligatures w14:val="none"/>
+        </w:rPr>
+      </w:r>
+      <w:r>
+        <w:rPr>
+          <w:b/>
+          <w:bCs/>
+          <w:color w:val="000000" w:themeColor="text1"/>
+          <w:sz w:val="28"/>
+          <w:szCs w:val="28"/>
+          <w:highlight w:val="none"/>
+          <w14:ligatures w14:val="none"/>
+        </w:rPr>
+        <w:t xml:space="preserve">.verticalScroll</w:t>
+      </w:r>
+      <w:r>
+        <w:rPr>
+          <w:sz w:val="28"/>
+          <w:szCs w:val="28"/>
+        </w:rPr>
+      </w:r>
+    </w:p>
+    <w:p>
+      <w:pPr>
+        <w:pBdr/>
+        <w:spacing/>
+        <w:ind/>
+        <w:rPr>
+          <w:highlight w:val="none"/>
+          <w14:ligatures w14:val="none"/>
+        </w:rPr>
+      </w:pPr>
+      <w:r>
+        <w:t xml:space="preserve">Con esta propiedad puede habilitar que los elementos internos de una columna puedan ser scrolleados, el siguiente es un ejemplo que se aplic</w:t>
+      </w:r>
+      <w:r>
+        <w:t xml:space="preserve">ó en una columna que ten</w:t>
+      </w:r>
+      <w:r>
+        <w:t xml:space="preserve">ían varios Rows que no cab</w:t>
+      </w:r>
+      <w:r>
+        <w:t xml:space="preserve">ían a primera vista en la pantalla.</w:t>
+      </w:r>
+      <w:r/>
+    </w:p>
+    <w:p>
+      <w:pPr>
+        <w:pBdr>
+          <w:top w:val="none" w:color="000000" w:sz="4" w:space="0"/>
+          <w:left w:val="none" w:color="000000" w:sz="4" w:space="0"/>
+          <w:bottom w:val="none" w:color="000000" w:sz="4" w:space="0"/>
+          <w:right w:val="none" w:color="000000" w:sz="4" w:space="0"/>
+        </w:pBdr>
+        <w:shd w:val="clear" w:color="1e1f22" w:fill="1e1f22"/>
+        <w:spacing/>
+        <w:ind w:right="0" w:firstLine="0" w:left="0"/>
+        <w:rPr>
+          <w:rFonts w:ascii="Arial" w:hAnsi="Arial" w:eastAsia="Arial" w:cs="Arial"/>
+          <w:b/>
+          <w:bCs/>
+          <w:color w:val="bcbec4"/>
+          <w:sz w:val="24"/>
+          <w:szCs w:val="24"/>
+        </w:rPr>
+      </w:pPr>
+      <w:r>
+        <w:rPr>
+          <w:rFonts w:ascii="Arial" w:hAnsi="Arial" w:eastAsia="Arial" w:cs="Arial"/>
+          <w:color w:val="0da19e"/>
+          <w:sz w:val="24"/>
+        </w:rPr>
+        <w:t xml:space="preserve">Column</w:t>
+      </w:r>
+      <w:r>
+        <w:rPr>
+          <w:rFonts w:ascii="Arial" w:hAnsi="Arial" w:eastAsia="Arial" w:cs="Arial"/>
+          <w:color w:val="bcbec4"/>
+          <w:sz w:val="24"/>
+        </w:rPr>
+        <w:t xml:space="preserve">(</w:t>
+        <w:br/>
+        <w:t xml:space="preserve">    </w:t>
+      </w:r>
+      <w:r>
+        <w:rPr>
+          <w:rFonts w:ascii="Arial" w:hAnsi="Arial" w:eastAsia="Arial" w:cs="Arial"/>
+          <w:color w:val="56c1d6"/>
+          <w:sz w:val="24"/>
+        </w:rPr>
+        <w:t xml:space="preserve">modifier = </w:t>
+      </w:r>
+      <w:r>
+        <w:rPr>
+          <w:rFonts w:ascii="Arial" w:hAnsi="Arial" w:eastAsia="Arial" w:cs="Arial"/>
+          <w:color w:val="bcbec4"/>
+          <w:sz w:val="24"/>
+        </w:rPr>
+        <w:t xml:space="preserve">Modifier.</w:t>
+      </w:r>
+      <w:r>
+        <w:rPr>
+          <w:rFonts w:ascii="Arial" w:hAnsi="Arial" w:eastAsia="Arial" w:cs="Arial"/>
+          <w:i/>
+          <w:color w:val="57aaf7"/>
+          <w:sz w:val="24"/>
+        </w:rPr>
+        <w:t xml:space="preserve">verticalScroll</w:t>
+      </w:r>
+      <w:r>
+        <w:rPr>
+          <w:rFonts w:ascii="Arial" w:hAnsi="Arial" w:eastAsia="Arial" w:cs="Arial"/>
+          <w:color w:val="bcbec4"/>
+          <w:sz w:val="24"/>
+        </w:rPr>
+        <w:t xml:space="preserve">(</w:t>
+      </w:r>
+      <w:r>
+        <w:rPr>
+          <w:rFonts w:ascii="Arial" w:hAnsi="Arial" w:eastAsia="Arial" w:cs="Arial"/>
+          <w:color w:val="6bb38a"/>
+          <w:sz w:val="24"/>
+        </w:rPr>
+        <w:t xml:space="preserve">rememberScrollState</w:t>
+      </w:r>
+      <w:r>
+        <w:rPr>
+          <w:rFonts w:ascii="Arial" w:hAnsi="Arial" w:eastAsia="Arial" w:cs="Arial"/>
+          <w:color w:val="bcbec4"/>
+          <w:sz w:val="24"/>
+        </w:rPr>
+        <w:t xml:space="preserve">()),</w:t>
+        <w:br/>
+        <w:t xml:space="preserve">    </w:t>
+      </w:r>
+      <w:r>
+        <w:rPr>
+          <w:rFonts w:ascii="Arial" w:hAnsi="Arial" w:eastAsia="Arial" w:cs="Arial"/>
+          <w:color w:val="56c1d6"/>
+          <w:sz w:val="24"/>
+        </w:rPr>
+        <w:t xml:space="preserve">horizontalAlignment = </w:t>
+      </w:r>
+      <w:r>
+        <w:rPr>
+          <w:rFonts w:ascii="Arial" w:hAnsi="Arial" w:eastAsia="Arial" w:cs="Arial"/>
+          <w:color w:val="bcbec4"/>
+          <w:sz w:val="24"/>
+        </w:rPr>
+        <w:t xml:space="preserve">Alignment.</w:t>
+      </w:r>
+      <w:r>
+        <w:rPr>
+          <w:rFonts w:ascii="Arial" w:hAnsi="Arial" w:eastAsia="Arial" w:cs="Arial"/>
+          <w:color w:val="c77dbb"/>
+          <w:sz w:val="24"/>
+        </w:rPr>
+        <w:t xml:space="preserve">CenterHorizontally</w:t>
+      </w:r>
+      <w:r>
+        <w:rPr>
+          <w:rFonts w:ascii="Arial" w:hAnsi="Arial" w:eastAsia="Arial" w:cs="Arial"/>
+          <w:color w:val="bcbec4"/>
+          <w:sz w:val="24"/>
+        </w:rPr>
+        <w:t xml:space="preserve">) </w:t>
+      </w:r>
+      <w:r>
+        <w:rPr>
+          <w:rFonts w:ascii="Arial" w:hAnsi="Arial" w:eastAsia="Arial" w:cs="Arial"/>
+          <w:b/>
+          <w:color w:val="bcbec4"/>
+          <w:sz w:val="24"/>
+        </w:rPr>
+        <w:t xml:space="preserve">{</w:t>
+      </w:r>
+      <w:r>
+        <w:rPr>
+          <w:sz w:val="24"/>
+        </w:rPr>
+      </w:r>
+    </w:p>
+    <w:p>
+      <w:pPr>
+        <w:pBdr>
+          <w:top w:val="none" w:color="000000" w:sz="4" w:space="0"/>
+          <w:left w:val="none" w:color="000000" w:sz="4" w:space="0"/>
+          <w:bottom w:val="none" w:color="000000" w:sz="4" w:space="0"/>
+          <w:right w:val="none" w:color="000000" w:sz="4" w:space="0"/>
+        </w:pBdr>
+        <w:shd w:val="clear" w:color="1e1f22" w:fill="1e1f22"/>
+        <w:spacing/>
+        <w:ind w:right="0" w:firstLine="708" w:left="0"/>
+        <w:rPr>
+          <w:sz w:val="24"/>
+          <w:szCs w:val="24"/>
+        </w:rPr>
+      </w:pPr>
+      <w:r>
+        <w:rPr>
+          <w:rFonts w:ascii="Arial" w:hAnsi="Arial" w:eastAsia="Arial" w:cs="Arial"/>
+          <w:b/>
+          <w:color w:val="bcbec4"/>
+          <w:sz w:val="24"/>
+        </w:rPr>
+      </w:r>
+      <w:r>
+        <w:rPr>
+          <w:rFonts w:ascii="Arial" w:hAnsi="Arial" w:eastAsia="Arial" w:cs="Arial"/>
+          <w:color w:val="6bb38a"/>
+          <w:sz w:val="24"/>
+        </w:rPr>
+        <w:t xml:space="preserve">RenglonMetro</w:t>
+      </w:r>
+      <w:r>
+        <w:rPr>
+          <w:rFonts w:ascii="Arial" w:hAnsi="Arial" w:eastAsia="Arial" w:cs="Arial"/>
+          <w:color w:val="bcbec4"/>
+          <w:sz w:val="24"/>
+        </w:rPr>
+        <w:t xml:space="preserve">()</w:t>
+        <w:br/>
+        <w:tab/>
+      </w:r>
+      <w:r>
+        <w:rPr>
+          <w:rFonts w:ascii="Arial" w:hAnsi="Arial" w:eastAsia="Arial" w:cs="Arial"/>
+          <w:color w:val="6bb38a"/>
+          <w:sz w:val="24"/>
+        </w:rPr>
+        <w:t xml:space="preserve">RenglonKilometro</w:t>
+      </w:r>
+      <w:r>
+        <w:rPr>
+          <w:rFonts w:ascii="Arial" w:hAnsi="Arial" w:eastAsia="Arial" w:cs="Arial"/>
+          <w:color w:val="bcbec4"/>
+          <w:sz w:val="24"/>
+        </w:rPr>
+        <w:t xml:space="preserve">()</w:t>
+        <w:br/>
+        <w:tab/>
+      </w:r>
+      <w:r>
+        <w:rPr>
+          <w:rFonts w:ascii="Arial" w:hAnsi="Arial" w:eastAsia="Arial" w:cs="Arial"/>
+          <w:color w:val="6bb38a"/>
+          <w:sz w:val="24"/>
+        </w:rPr>
+        <w:t xml:space="preserve">RenglonCentimetro</w:t>
+      </w:r>
+      <w:r>
+        <w:rPr>
+          <w:rFonts w:ascii="Arial" w:hAnsi="Arial" w:eastAsia="Arial" w:cs="Arial"/>
+          <w:color w:val="bcbec4"/>
+          <w:sz w:val="24"/>
+        </w:rPr>
+        <w:t xml:space="preserve">()</w:t>
+        <w:br/>
+        <w:tab/>
+      </w:r>
+      <w:r>
+        <w:rPr>
+          <w:rFonts w:ascii="Arial" w:hAnsi="Arial" w:eastAsia="Arial" w:cs="Arial"/>
+          <w:color w:val="6bb38a"/>
+          <w:sz w:val="24"/>
+        </w:rPr>
+        <w:t xml:space="preserve">RenglonPulgada</w:t>
+      </w:r>
+      <w:r>
+        <w:rPr>
+          <w:rFonts w:ascii="Arial" w:hAnsi="Arial" w:eastAsia="Arial" w:cs="Arial"/>
+          <w:color w:val="bcbec4"/>
+          <w:sz w:val="24"/>
+        </w:rPr>
+        <w:t xml:space="preserve">()</w:t>
+        <w:br/>
+        <w:tab/>
+      </w:r>
+      <w:r>
+        <w:rPr>
+          <w:rFonts w:ascii="Arial" w:hAnsi="Arial" w:eastAsia="Arial" w:cs="Arial"/>
+          <w:color w:val="6bb38a"/>
+          <w:sz w:val="24"/>
+        </w:rPr>
+        <w:t xml:space="preserve">RenglonPie</w:t>
+      </w:r>
+      <w:r>
+        <w:rPr>
+          <w:rFonts w:ascii="Arial" w:hAnsi="Arial" w:eastAsia="Arial" w:cs="Arial"/>
+          <w:color w:val="bcbec4"/>
+          <w:sz w:val="24"/>
+        </w:rPr>
+        <w:t xml:space="preserve">()</w:t>
+        <w:br/>
+        <w:tab/>
+      </w:r>
+      <w:r>
+        <w:rPr>
+          <w:rFonts w:ascii="Arial" w:hAnsi="Arial" w:eastAsia="Arial" w:cs="Arial"/>
+          <w:color w:val="6bb38a"/>
+          <w:sz w:val="24"/>
+        </w:rPr>
+        <w:t xml:space="preserve">RenglonYarda</w:t>
+      </w:r>
+      <w:r>
+        <w:rPr>
+          <w:rFonts w:ascii="Arial" w:hAnsi="Arial" w:eastAsia="Arial" w:cs="Arial"/>
+          <w:color w:val="bcbec4"/>
+          <w:sz w:val="24"/>
+        </w:rPr>
+        <w:t xml:space="preserve">()</w:t>
+        <w:br/>
+        <w:tab/>
+      </w:r>
+      <w:r>
+        <w:rPr>
+          <w:rFonts w:ascii="Arial" w:hAnsi="Arial" w:eastAsia="Arial" w:cs="Arial"/>
+          <w:color w:val="6bb38a"/>
+          <w:sz w:val="24"/>
+        </w:rPr>
+        <w:t xml:space="preserve">RenglonMilla</w:t>
+      </w:r>
+      <w:r>
+        <w:rPr>
+          <w:rFonts w:ascii="Arial" w:hAnsi="Arial" w:eastAsia="Arial" w:cs="Arial"/>
+          <w:color w:val="bcbec4"/>
+          <w:sz w:val="24"/>
+        </w:rPr>
+        <w:t xml:space="preserve">()</w:t>
+        <w:br/>
+        <w:tab/>
+      </w:r>
+      <w:r>
+        <w:rPr>
+          <w:rFonts w:ascii="Arial" w:hAnsi="Arial" w:eastAsia="Arial" w:cs="Arial"/>
+          <w:color w:val="6bb38a"/>
+          <w:sz w:val="24"/>
+        </w:rPr>
+        <w:t xml:space="preserve">RenglonMillaNautica</w:t>
+      </w:r>
+      <w:r>
+        <w:rPr>
+          <w:rFonts w:ascii="Arial" w:hAnsi="Arial" w:eastAsia="Arial" w:cs="Arial"/>
+          <w:color w:val="bcbec4"/>
+          <w:sz w:val="24"/>
+        </w:rPr>
+        <w:t xml:space="preserve">()</w:t>
+        <w:br/>
+        <w:tab/>
+      </w:r>
+      <w:r>
+        <w:rPr>
+          <w:rFonts w:ascii="Arial" w:hAnsi="Arial" w:eastAsia="Arial" w:cs="Arial"/>
+          <w:color w:val="6bb38a"/>
+          <w:sz w:val="24"/>
+        </w:rPr>
+        <w:t xml:space="preserve">RenglonAnosLuz</w:t>
+      </w:r>
+      <w:r>
+        <w:rPr>
+          <w:rFonts w:ascii="Arial" w:hAnsi="Arial" w:eastAsia="Arial" w:cs="Arial"/>
+          <w:color w:val="bcbec4"/>
+          <w:sz w:val="24"/>
+        </w:rPr>
+        <w:t xml:space="preserve">()</w:t>
+        <w:br/>
+      </w:r>
+      <w:r>
+        <w:rPr>
+          <w:rFonts w:ascii="Arial" w:hAnsi="Arial" w:eastAsia="Arial" w:cs="Arial"/>
+          <w:b/>
+          <w:color w:val="bcbec4"/>
+          <w:sz w:val="24"/>
+        </w:rPr>
+        <w:t xml:space="preserve">}</w:t>
+      </w:r>
+      <w:r/>
+      <w:r/>
+    </w:p>
+    <w:p>
+      <w:pPr>
+        <w:pBdr/>
+        <w:spacing/>
+        <w:ind/>
+        <w:rPr>
+          <w14:ligatures w14:val="none"/>
+        </w:rPr>
+      </w:pPr>
+      <w:r>
+        <w:rPr>
           <w:highlight w:val="none"/>
         </w:rPr>
       </w:r>
@@ -3961,7 +4518,7 @@
       <w:endnotePr/>
       <w:type w:val="nextPage"/>
       <w:pgSz w:h="16838" w:orient="portrait" w:w="11906"/>
-      <w:pgMar w:top="1134" w:right="850" w:bottom="1134" w:left="1701" w:header="709" w:footer="709" w:gutter="0"/>
+      <w:pgMar w:top="1134" w:right="1134" w:bottom="1134" w:left="1134" w:header="709" w:footer="709" w:gutter="0"/>
       <w:cols w:num="1" w:sep="0" w:space="708" w:equalWidth="1"/>
     </w:sectPr>
   </w:body>

</xml_diff>